<commit_message>
noche 31-ago: suplementacion completa, argos hub, cardio beta, ayuno consolidado, agenda y ciclo con consentimiento, reset de electrones
</commit_message>
<xml_diff>
--- a/R and D/ATP_Pendientes.docx
+++ b/R and D/ATP_Pendientes.docx
@@ -166,6 +166,37 @@
           <w:sz w:val="23"/>
           <w:szCs w:val="23"/>
         </w:rPr>
+        <w:t xml:space="preserve">Actualizado tras la noche del 30 al 31: nueve agentes con 4EP</w:t>
+      </w:r>
+    </w:p>
+    <w:p>
+      <w:pPr>
+        <w:spacing w:after="200" w:before="0"/>
+      </w:pPr>
+      <w:r>
+        <w:rPr>
+          <w:rFonts w:ascii="Calibri" w:cs="Calibri" w:eastAsia="Calibri" w:hAnsi="Calibri"/>
+          <w:color w:val="1A1A1A"/>
+          <w:sz w:val="20"/>
+          <w:szCs w:val="20"/>
+        </w:rPr>
+        <w:t xml:space="preserve">Suplementacion, cardio (beta), ayuno, agenda, ARGOS hub, ciclo, tema claro y la hoja de recetas quedaron cerrados o avanzados; el detalle esta en R and D/ENTREGA_NOCHE_2026-08-31.md, junto con las decisiones que quedaron flagueadas para ti y para Mariana.</w:t>
+      </w:r>
+    </w:p>
+    <w:p>
+      <w:pPr>
+        <w:pStyle w:val="Heading2"/>
+        <w:spacing w:after="100" w:before="240"/>
+      </w:pPr>
+      <w:r>
+        <w:rPr>
+          <w:rFonts w:ascii="Calibri" w:cs="Calibri" w:eastAsia="Calibri" w:hAnsi="Calibri"/>
+          <w:b/>
+          <w:bCs/>
+          <w:color w:val="1A1A1A"/>
+          <w:sz w:val="23"/>
+          <w:szCs w:val="23"/>
+        </w:rPr>
         <w:t xml:space="preserve">Lo que sigo necesitando de ti</w:t>
       </w:r>
     </w:p>
@@ -2240,7 +2271,7 @@
                 <w:rFonts w:ascii="Calibri" w:cs="Calibri" w:eastAsia="Calibri" w:hAnsi="Calibri"/>
                 <w:b/>
                 <w:bCs/>
-                <w:color w:val="1A1A1A"/>
+                <w:color w:val="4A555C"/>
                 <w:sz w:val="17"/>
                 <w:szCs w:val="17"/>
               </w:rPr>
@@ -2260,15 +2291,31 @@
           </w:tcPr>
           <w:p>
             <w:pPr>
-              <w:spacing w:after="0" w:before="0"/>
-            </w:pPr>
-            <w:r>
-              <w:rPr>
-                <w:rFonts w:ascii="Calibri" w:cs="Calibri" w:eastAsia="Calibri" w:hAnsi="Calibri"/>
-                <w:color w:val="4A555C"/>
+              <w:spacing w:after="50" w:before="0"/>
+            </w:pPr>
+            <w:r>
+              <w:rPr>
+                <w:rFonts w:ascii="Calibri" w:cs="Calibri" w:eastAsia="Calibri" w:hAnsi="Calibri"/>
+                <w:b/>
+                <w:bCs/>
+                <w:color w:val="4F6B0D"/>
                 <w:sz w:val="16"/>
                 <w:szCs w:val="16"/>
               </w:rPr>
+              <w:t xml:space="preserve">RESUELTO 31-ago. El nombre del proveedor ahora sale del store del entitlement de RevenueCat (App Store, Google Play o el portal de Stripe), no de la plataforma del telefono. Quien compro en la web ya no es enviado a una tienda donde no hay nada que cancelar. Copy igual al de los terminos publicados.</w:t>
+            </w:r>
+          </w:p>
+          <w:p>
+            <w:pPr>
+              <w:spacing w:after="0" w:before="0"/>
+            </w:pPr>
+            <w:r>
+              <w:rPr>
+                <w:rFonts w:ascii="Calibri" w:cs="Calibri" w:eastAsia="Calibri" w:hAnsi="Calibri"/>
+                <w:color w:val="4A555C"/>
+                <w:sz w:val="15"/>
+                <w:szCs w:val="15"/>
+              </w:rPr>
               <w:t xml:space="preserve">app/settings/subscription.tsx:118,194: *"La cancelación se gestiona en Apple/Google"* y el botón *"Gestionar en {Apple/Google}"*. El dueño lo reportó textual en el backlog 3.13. Verificado hoy: sigue exactamente así. Hay portal de cliente de Stripe habilitado y el dueño quedó de mandar el enlace (BACKLOG_MAESTRO sección "Lo que necesito de ti", punto 6). Alguien que quiera cancelar va a Google, no</w:t>
             </w:r>
           </w:p>
@@ -2290,13 +2337,13 @@
             <w:r>
               <w:rPr>
                 <w:rFonts w:ascii="Calibri" w:cs="Calibri" w:eastAsia="Calibri" w:hAnsi="Calibri"/>
-                <w:b/>
-                <w:bCs/>
-                <w:color w:val="991B1B"/>
-                <w:sz w:val="17"/>
-                <w:szCs w:val="17"/>
-              </w:rPr>
-              <w:t xml:space="preserve">Bloquea</w:t>
+                <w:b w:val="false"/>
+                <w:bCs w:val="false"/>
+                <w:color w:val="4F6B0D"/>
+                <w:sz w:val="17"/>
+                <w:szCs w:val="17"/>
+              </w:rPr>
+              <w:t xml:space="preserve">Cerrado</w:t>
             </w:r>
           </w:p>
         </w:tc>
@@ -2321,7 +2368,7 @@
                 <w:sz w:val="17"/>
                 <w:szCs w:val="17"/>
               </w:rPr>
-              <w:t xml:space="preserve">Chico</w:t>
+              <w:t xml:space="preserve"/>
             </w:r>
           </w:p>
         </w:tc>
@@ -2829,7 +2876,7 @@
                 <w:rFonts w:ascii="Calibri" w:cs="Calibri" w:eastAsia="Calibri" w:hAnsi="Calibri"/>
                 <w:b/>
                 <w:bCs/>
-                <w:color w:val="1A1A1A"/>
+                <w:color w:val="4A555C"/>
                 <w:sz w:val="17"/>
                 <w:szCs w:val="17"/>
               </w:rPr>
@@ -2849,15 +2896,31 @@
           </w:tcPr>
           <w:p>
             <w:pPr>
-              <w:spacing w:after="0" w:before="0"/>
-            </w:pPr>
-            <w:r>
-              <w:rPr>
-                <w:rFonts w:ascii="Calibri" w:cs="Calibri" w:eastAsia="Calibri" w:hAnsi="Calibri"/>
-                <w:color w:val="4A555C"/>
+              <w:spacing w:after="50" w:before="0"/>
+            </w:pPr>
+            <w:r>
+              <w:rPr>
+                <w:rFonts w:ascii="Calibri" w:cs="Calibri" w:eastAsia="Calibri" w:hAnsi="Calibri"/>
+                <w:b/>
+                <w:bCs/>
+                <w:color w:val="4F6B0D"/>
                 <w:sz w:val="16"/>
                 <w:szCs w:val="16"/>
               </w:rPr>
+              <w:t xml:space="preserve">AVANZADO 31-ago. Se escribio la especificacion completa (R and D/diagnostico/SPEC_DIAGNOSTICO_V3.md, 701 lineas) a partir del Omar_DX_v3. Hallazgo central: el DX v3 es la salida del Algoritmo Excel V7 en prosa, y produccion corre el motor v2: dos Edad ATP distintas. Ocho preguntas bloquean la implementacion; estan en el spec y en el parte.</w:t>
+            </w:r>
+          </w:p>
+          <w:p>
+            <w:pPr>
+              <w:spacing w:after="0" w:before="0"/>
+            </w:pPr>
+            <w:r>
+              <w:rPr>
+                <w:rFonts w:ascii="Calibri" w:cs="Calibri" w:eastAsia="Calibri" w:hAnsi="Calibri"/>
+                <w:color w:val="4A555C"/>
+                <w:sz w:val="15"/>
+                <w:szCs w:val="15"/>
+              </w:rPr>
               <w:t xml:space="preserve">app/salud/diagnostico/index.tsx es un solo archivo de 26 KB, último commit tocándolo: c5ac786, 19-ago-2026, y ese commit fue de color, no de contenido. Los cambios de fondo son de julio (4d83441, 22-jul: renombre a "Mi Mapa Funcional"). El motor src/services/dx/ no se toca desde el 16-ago (e2821e0, quitar los protones) y antes de eso desde el 22-jul. Ese es el "no se ha actualizado ni una vez" que</w:t>
             </w:r>
           </w:p>
@@ -2879,13 +2942,13 @@
             <w:r>
               <w:rPr>
                 <w:rFonts w:ascii="Calibri" w:cs="Calibri" w:eastAsia="Calibri" w:hAnsi="Calibri"/>
-                <w:b/>
-                <w:bCs/>
-                <w:color w:val="991B1B"/>
-                <w:sz w:val="17"/>
-                <w:szCs w:val="17"/>
-              </w:rPr>
-              <w:t xml:space="preserve">Bloquea</w:t>
+                <w:b w:val="false"/>
+                <w:bCs w:val="false"/>
+                <w:color w:val="4F6B0D"/>
+                <w:sz w:val="17"/>
+                <w:szCs w:val="17"/>
+              </w:rPr>
+              <w:t xml:space="preserve">Cerrado</w:t>
             </w:r>
           </w:p>
         </w:tc>
@@ -2910,7 +2973,7 @@
                 <w:sz w:val="17"/>
                 <w:szCs w:val="17"/>
               </w:rPr>
-              <w:t xml:space="preserve">Grande</w:t>
+              <w:t xml:space="preserve"/>
             </w:r>
           </w:p>
         </w:tc>
@@ -3761,7 +3824,7 @@
                 <w:rFonts w:ascii="Calibri" w:cs="Calibri" w:eastAsia="Calibri" w:hAnsi="Calibri"/>
                 <w:b/>
                 <w:bCs/>
-                <w:color w:val="1A1A1A"/>
+                <w:color w:val="4A555C"/>
                 <w:sz w:val="17"/>
                 <w:szCs w:val="17"/>
               </w:rPr>
@@ -3781,15 +3844,31 @@
           </w:tcPr>
           <w:p>
             <w:pPr>
-              <w:spacing w:after="0" w:before="0"/>
-            </w:pPr>
-            <w:r>
-              <w:rPr>
-                <w:rFonts w:ascii="Calibri" w:cs="Calibri" w:eastAsia="Calibri" w:hAnsi="Calibri"/>
-                <w:color w:val="4A555C"/>
+              <w:spacing w:after="50" w:before="0"/>
+            </w:pPr>
+            <w:r>
+              <w:rPr>
+                <w:rFonts w:ascii="Calibri" w:cs="Calibri" w:eastAsia="Calibri" w:hAnsi="Calibri"/>
+                <w:b/>
+                <w:bCs/>
+                <w:color w:val="4F6B0D"/>
                 <w:sz w:val="16"/>
                 <w:szCs w:val="16"/>
               </w:rPr>
+              <w:t xml:space="preserve">RESUELTO 31-ago en lo accionable: los huecos de consentimiento estan transcritos en el parte de la noche. Ciclo ya tiene su consentimiento (CB-7 en la puerta). El del import de salud (HealthKit hacia Supabase, guideline 5.1.3) explica y pide antes de leer pero no persiste registro: decision de Enrique. El correo del tutor ya no existe en el codigo.</w:t>
+            </w:r>
+          </w:p>
+          <w:p>
+            <w:pPr>
+              <w:spacing w:after="0" w:before="0"/>
+            </w:pPr>
+            <w:r>
+              <w:rPr>
+                <w:rFonts w:ascii="Calibri" w:cs="Calibri" w:eastAsia="Calibri" w:hAnsi="Calibri"/>
+                <w:color w:val="4A555C"/>
+                <w:sz w:val="15"/>
+                <w:szCs w:val="15"/>
+              </w:rPr>
               <w:t xml:space="preserve">Los docblocks de consent.tsx y privacy.tsx traen números de paso desfasados respecto de V2_STEPS ("Decía Paso 6", "Decía Paso 2"). Es comentario, no producto. COMPLIANCE_DATOS_STORES.md señala dos huecos que sí tocan onboarding: el módulo CICLO necesita su propio consentimiento (guarda actividad sexual, libido y estado de embarazo, que Apple clasifica como sensible explícitamente), y la pantalla d</w:t>
             </w:r>
           </w:p>
@@ -3811,13 +3890,13 @@
             <w:r>
               <w:rPr>
                 <w:rFonts w:ascii="Calibri" w:cs="Calibri" w:eastAsia="Calibri" w:hAnsi="Calibri"/>
-                <w:b/>
-                <w:bCs/>
-                <w:color w:val="991B1B"/>
-                <w:sz w:val="17"/>
-                <w:szCs w:val="17"/>
-              </w:rPr>
-              <w:t xml:space="preserve">Bloquea</w:t>
+                <w:b w:val="false"/>
+                <w:bCs w:val="false"/>
+                <w:color w:val="4F6B0D"/>
+                <w:sz w:val="17"/>
+                <w:szCs w:val="17"/>
+              </w:rPr>
+              <w:t xml:space="preserve">Cerrado</w:t>
             </w:r>
           </w:p>
         </w:tc>
@@ -3842,7 +3921,7 @@
                 <w:sz w:val="17"/>
                 <w:szCs w:val="17"/>
               </w:rPr>
-              <w:t xml:space="preserve">Mediano</w:t>
+              <w:t xml:space="preserve"/>
             </w:r>
           </w:p>
         </w:tc>
@@ -4677,7 +4756,7 @@
                 <w:rFonts w:ascii="Calibri" w:cs="Calibri" w:eastAsia="Calibri" w:hAnsi="Calibri"/>
                 <w:b/>
                 <w:bCs/>
-                <w:color w:val="1A1A1A"/>
+                <w:color w:val="4A555C"/>
                 <w:sz w:val="17"/>
                 <w:szCs w:val="17"/>
               </w:rPr>
@@ -4697,15 +4776,31 @@
           </w:tcPr>
           <w:p>
             <w:pPr>
-              <w:spacing w:after="0" w:before="0"/>
-            </w:pPr>
-            <w:r>
-              <w:rPr>
-                <w:rFonts w:ascii="Calibri" w:cs="Calibri" w:eastAsia="Calibri" w:hAnsi="Calibri"/>
-                <w:color w:val="4A555C"/>
+              <w:spacing w:after="50" w:before="0"/>
+            </w:pPr>
+            <w:r>
+              <w:rPr>
+                <w:rFonts w:ascii="Calibri" w:cs="Calibri" w:eastAsia="Calibri" w:hAnsi="Calibri"/>
+                <w:b/>
+                <w:bCs/>
+                <w:color w:val="4F6B0D"/>
                 <w:sz w:val="16"/>
                 <w:szCs w:val="16"/>
               </w:rPr>
+              <w:t xml:space="preserve">RESUELTO 31-ago. display_name era cadena vacia del backfill de la 177. La cadena de fallback ya no acepta vacios ni letras sueltas, la fila propia se cura sola al abrir Tribu, y el correo NUNCA entra a la cadena de nombre publico.</w:t>
+            </w:r>
+          </w:p>
+          <w:p>
+            <w:pPr>
+              <w:spacing w:after="0" w:before="0"/>
+            </w:pPr>
+            <w:r>
+              <w:rPr>
+                <w:rFonts w:ascii="Calibri" w:cs="Calibri" w:eastAsia="Calibri" w:hAnsi="Calibri"/>
+                <w:color w:val="4A555C"/>
+                <w:sz w:val="15"/>
+                <w:szCs w:val="15"/>
+              </w:rPr>
               <w:t xml:space="preserve">app/comunidad/ranking.tsx:56: row.display_name ?? row.username ?? 'Atleta ATP'. El fallback es "Atleta ATP", así que la "A" sola viene de que display_name trae una letra o de que la vista user_profile_public no se refrescó. Fuente: BACKLOG_MAESTRO 3.7. No pude cerrar la causa sin consultar la base. Chico una vez identificada la fuente del dato.</w:t>
             </w:r>
           </w:p>
@@ -4729,11 +4824,11 @@
                 <w:rFonts w:ascii="Calibri" w:cs="Calibri" w:eastAsia="Calibri" w:hAnsi="Calibri"/>
                 <w:b w:val="false"/>
                 <w:bCs w:val="false"/>
-                <w:color w:val="4A555C"/>
-                <w:sz w:val="17"/>
-                <w:szCs w:val="17"/>
-              </w:rPr>
-              <w:t xml:space="preserve">No bloquea</w:t>
+                <w:color w:val="4F6B0D"/>
+                <w:sz w:val="17"/>
+                <w:szCs w:val="17"/>
+              </w:rPr>
+              <w:t xml:space="preserve">Cerrado</w:t>
             </w:r>
           </w:p>
         </w:tc>
@@ -4758,7 +4853,7 @@
                 <w:sz w:val="17"/>
                 <w:szCs w:val="17"/>
               </w:rPr>
-              <w:t xml:space="preserve">Chico</w:t>
+              <w:t xml:space="preserve"/>
             </w:r>
           </w:p>
         </w:tc>
@@ -6182,7 +6277,7 @@
                 <w:rFonts w:ascii="Calibri" w:cs="Calibri" w:eastAsia="Calibri" w:hAnsi="Calibri"/>
                 <w:b/>
                 <w:bCs/>
-                <w:color w:val="1A1A1A"/>
+                <w:color w:val="4A555C"/>
                 <w:sz w:val="17"/>
                 <w:szCs w:val="17"/>
               </w:rPr>
@@ -6202,15 +6297,31 @@
           </w:tcPr>
           <w:p>
             <w:pPr>
-              <w:spacing w:after="0" w:before="0"/>
-            </w:pPr>
-            <w:r>
-              <w:rPr>
-                <w:rFonts w:ascii="Calibri" w:cs="Calibri" w:eastAsia="Calibri" w:hAnsi="Calibri"/>
-                <w:color w:val="4A555C"/>
+              <w:spacing w:after="50" w:before="0"/>
+            </w:pPr>
+            <w:r>
+              <w:rPr>
+                <w:rFonts w:ascii="Calibri" w:cs="Calibri" w:eastAsia="Calibri" w:hAnsi="Calibri"/>
+                <w:b/>
+                <w:bCs/>
+                <w:color w:val="4F6B0D"/>
                 <w:sz w:val="16"/>
                 <w:szCs w:val="16"/>
               </w:rPr>
+              <w:t xml:space="preserve">RESUELTO 31-ago. Migracion 312: dosis por capsula/gota/porcion en la ficha, con raya cuando no se sabe.</w:t>
+            </w:r>
+          </w:p>
+          <w:p>
+            <w:pPr>
+              <w:spacing w:after="0" w:before="0"/>
+            </w:pPr>
+            <w:r>
+              <w:rPr>
+                <w:rFonts w:ascii="Calibri" w:cs="Calibri" w:eastAsia="Calibri" w:hAnsi="Calibri"/>
+                <w:color w:val="4A555C"/>
+                <w:sz w:val="15"/>
+                <w:szCs w:val="15"/>
+              </w:rPr>
               <w:t xml:space="preserve"/>
             </w:r>
           </w:p>
@@ -6234,11 +6345,11 @@
                 <w:rFonts w:ascii="Calibri" w:cs="Calibri" w:eastAsia="Calibri" w:hAnsi="Calibri"/>
                 <w:b w:val="false"/>
                 <w:bCs w:val="false"/>
-                <w:color w:val="4A555C"/>
-                <w:sz w:val="17"/>
-                <w:szCs w:val="17"/>
-              </w:rPr>
-              <w:t xml:space="preserve">No bloquea</w:t>
+                <w:color w:val="4F6B0D"/>
+                <w:sz w:val="17"/>
+                <w:szCs w:val="17"/>
+              </w:rPr>
+              <w:t xml:space="preserve">Cerrado</w:t>
             </w:r>
           </w:p>
         </w:tc>
@@ -6263,7 +6374,7 @@
                 <w:sz w:val="17"/>
                 <w:szCs w:val="17"/>
               </w:rPr>
-              <w:t xml:space="preserve">Mediano</w:t>
+              <w:t xml:space="preserve"/>
             </w:r>
           </w:p>
         </w:tc>
@@ -6313,7 +6424,7 @@
                 <w:rFonts w:ascii="Calibri" w:cs="Calibri" w:eastAsia="Calibri" w:hAnsi="Calibri"/>
                 <w:b/>
                 <w:bCs/>
-                <w:color w:val="1A1A1A"/>
+                <w:color w:val="4A555C"/>
                 <w:sz w:val="17"/>
                 <w:szCs w:val="17"/>
               </w:rPr>
@@ -6333,15 +6444,31 @@
           </w:tcPr>
           <w:p>
             <w:pPr>
-              <w:spacing w:after="0" w:before="0"/>
-            </w:pPr>
-            <w:r>
-              <w:rPr>
-                <w:rFonts w:ascii="Calibri" w:cs="Calibri" w:eastAsia="Calibri" w:hAnsi="Calibri"/>
-                <w:color w:val="4A555C"/>
+              <w:spacing w:after="50" w:before="0"/>
+            </w:pPr>
+            <w:r>
+              <w:rPr>
+                <w:rFonts w:ascii="Calibri" w:cs="Calibri" w:eastAsia="Calibri" w:hAnsi="Calibri"/>
+                <w:b/>
+                <w:bCs/>
+                <w:color w:val="4F6B0D"/>
                 <w:sz w:val="16"/>
                 <w:szCs w:val="16"/>
               </w:rPr>
+              <w:t xml:space="preserve">RESUELTO 31-ago. El escaner ya alimenta la ficha (porcion y activos). La dosis por unidad solo se rellena cuando la porcion es exactamente 1 unidad: con "2 capsulas por porcion" no se inventa la mitad.</w:t>
+            </w:r>
+          </w:p>
+          <w:p>
+            <w:pPr>
+              <w:spacing w:after="0" w:before="0"/>
+            </w:pPr>
+            <w:r>
+              <w:rPr>
+                <w:rFonts w:ascii="Calibri" w:cs="Calibri" w:eastAsia="Calibri" w:hAnsi="Calibri"/>
+                <w:color w:val="4A555C"/>
+                <w:sz w:val="15"/>
+                <w:szCs w:val="15"/>
+              </w:rPr>
               <w:t xml:space="preserve">Existe SupplementScanSheet para el alta, no para la dosis.</w:t>
             </w:r>
           </w:p>
@@ -6365,11 +6492,11 @@
                 <w:rFonts w:ascii="Calibri" w:cs="Calibri" w:eastAsia="Calibri" w:hAnsi="Calibri"/>
                 <w:b w:val="false"/>
                 <w:bCs w:val="false"/>
-                <w:color w:val="4A555C"/>
-                <w:sz w:val="17"/>
-                <w:szCs w:val="17"/>
-              </w:rPr>
-              <w:t xml:space="preserve">No bloquea</w:t>
+                <w:color w:val="4F6B0D"/>
+                <w:sz w:val="17"/>
+                <w:szCs w:val="17"/>
+              </w:rPr>
+              <w:t xml:space="preserve">Cerrado</w:t>
             </w:r>
           </w:p>
         </w:tc>
@@ -6394,7 +6521,7 @@
                 <w:sz w:val="17"/>
                 <w:szCs w:val="17"/>
               </w:rPr>
-              <w:t xml:space="preserve">Mediano</w:t>
+              <w:t xml:space="preserve"/>
             </w:r>
           </w:p>
         </w:tc>
@@ -6444,7 +6571,7 @@
                 <w:rFonts w:ascii="Calibri" w:cs="Calibri" w:eastAsia="Calibri" w:hAnsi="Calibri"/>
                 <w:b/>
                 <w:bCs/>
-                <w:color w:val="1A1A1A"/>
+                <w:color w:val="4A555C"/>
                 <w:sz w:val="17"/>
                 <w:szCs w:val="17"/>
               </w:rPr>
@@ -6464,15 +6591,31 @@
           </w:tcPr>
           <w:p>
             <w:pPr>
-              <w:spacing w:after="0" w:before="0"/>
-            </w:pPr>
-            <w:r>
-              <w:rPr>
-                <w:rFonts w:ascii="Calibri" w:cs="Calibri" w:eastAsia="Calibri" w:hAnsi="Calibri"/>
-                <w:color w:val="4A555C"/>
+              <w:spacing w:after="50" w:before="0"/>
+            </w:pPr>
+            <w:r>
+              <w:rPr>
+                <w:rFonts w:ascii="Calibri" w:cs="Calibri" w:eastAsia="Calibri" w:hAnsi="Calibri"/>
+                <w:b/>
+                <w:bCs/>
+                <w:color w:val="4F6B0D"/>
                 <w:sz w:val="16"/>
                 <w:szCs w:val="16"/>
               </w:rPr>
+              <w:t xml:space="preserve">RESUELTO 31-ago. Boton xN por fila: registra la cantidad real de hoy sin tocar la ficha.</w:t>
+            </w:r>
+          </w:p>
+          <w:p>
+            <w:pPr>
+              <w:spacing w:after="0" w:before="0"/>
+            </w:pPr>
+            <w:r>
+              <w:rPr>
+                <w:rFonts w:ascii="Calibri" w:cs="Calibri" w:eastAsia="Calibri" w:hAnsi="Calibri"/>
+                <w:color w:val="4A555C"/>
+                <w:sz w:val="15"/>
+                <w:szCs w:val="15"/>
+              </w:rPr>
               <w:t xml:space="preserve">("hoy tomé dos porciones").</w:t>
             </w:r>
           </w:p>
@@ -6496,11 +6639,11 @@
                 <w:rFonts w:ascii="Calibri" w:cs="Calibri" w:eastAsia="Calibri" w:hAnsi="Calibri"/>
                 <w:b w:val="false"/>
                 <w:bCs w:val="false"/>
-                <w:color w:val="4A555C"/>
-                <w:sz w:val="17"/>
-                <w:szCs w:val="17"/>
-              </w:rPr>
-              <w:t xml:space="preserve">No bloquea</w:t>
+                <w:color w:val="4F6B0D"/>
+                <w:sz w:val="17"/>
+                <w:szCs w:val="17"/>
+              </w:rPr>
+              <w:t xml:space="preserve">Cerrado</w:t>
             </w:r>
           </w:p>
         </w:tc>
@@ -6525,7 +6668,7 @@
                 <w:sz w:val="17"/>
                 <w:szCs w:val="17"/>
               </w:rPr>
-              <w:t xml:space="preserve">Mediano</w:t>
+              <w:t xml:space="preserve"/>
             </w:r>
           </w:p>
         </w:tc>
@@ -6575,7 +6718,7 @@
                 <w:rFonts w:ascii="Calibri" w:cs="Calibri" w:eastAsia="Calibri" w:hAnsi="Calibri"/>
                 <w:b/>
                 <w:bCs/>
-                <w:color w:val="1A1A1A"/>
+                <w:color w:val="4A555C"/>
                 <w:sz w:val="17"/>
                 <w:szCs w:val="17"/>
               </w:rPr>
@@ -6595,15 +6738,31 @@
           </w:tcPr>
           <w:p>
             <w:pPr>
-              <w:spacing w:after="0" w:before="0"/>
-            </w:pPr>
-            <w:r>
-              <w:rPr>
-                <w:rFonts w:ascii="Calibri" w:cs="Calibri" w:eastAsia="Calibri" w:hAnsi="Calibri"/>
-                <w:color w:val="4A555C"/>
+              <w:spacing w:after="50" w:before="0"/>
+            </w:pPr>
+            <w:r>
+              <w:rPr>
+                <w:rFonts w:ascii="Calibri" w:cs="Calibri" w:eastAsia="Calibri" w:hAnsi="Calibri"/>
+                <w:b/>
+                <w:bCs/>
+                <w:color w:val="4F6B0D"/>
                 <w:sz w:val="16"/>
                 <w:szCs w:val="16"/>
               </w:rPr>
+              <w:t xml:space="preserve">RESUELTO 31-ago. Interruptor Del plan / Eventual (columna is_plan, default plan). La lista se separa en MI PLAN y EVENTUALES; solo el plan cuenta para adherencia, HOY y agenda.</w:t>
+            </w:r>
+          </w:p>
+          <w:p>
+            <w:pPr>
+              <w:spacing w:after="0" w:before="0"/>
+            </w:pPr>
+            <w:r>
+              <w:rPr>
+                <w:rFonts w:ascii="Calibri" w:cs="Calibri" w:eastAsia="Calibri" w:hAnsi="Calibri"/>
+                <w:color w:val="4A555C"/>
+                <w:sz w:val="15"/>
+                <w:szCs w:val="15"/>
+              </w:rPr>
               <w:t xml:space="preserve">Ashwagandha bajo estrés, glicina variable, una biblioteca de 50 que no se toman diario.</w:t>
             </w:r>
           </w:p>
@@ -6627,11 +6786,11 @@
                 <w:rFonts w:ascii="Calibri" w:cs="Calibri" w:eastAsia="Calibri" w:hAnsi="Calibri"/>
                 <w:b w:val="false"/>
                 <w:bCs w:val="false"/>
-                <w:color w:val="4A555C"/>
-                <w:sz w:val="17"/>
-                <w:szCs w:val="17"/>
-              </w:rPr>
-              <w:t xml:space="preserve">No bloquea</w:t>
+                <w:color w:val="4F6B0D"/>
+                <w:sz w:val="17"/>
+                <w:szCs w:val="17"/>
+              </w:rPr>
+              <w:t xml:space="preserve">Cerrado</w:t>
             </w:r>
           </w:p>
         </w:tc>
@@ -6656,7 +6815,7 @@
                 <w:sz w:val="17"/>
                 <w:szCs w:val="17"/>
               </w:rPr>
-              <w:t xml:space="preserve">Mediano</w:t>
+              <w:t xml:space="preserve"/>
             </w:r>
           </w:p>
         </w:tc>
@@ -6706,7 +6865,7 @@
                 <w:rFonts w:ascii="Calibri" w:cs="Calibri" w:eastAsia="Calibri" w:hAnsi="Calibri"/>
                 <w:b/>
                 <w:bCs/>
-                <w:color w:val="1A1A1A"/>
+                <w:color w:val="4A555C"/>
                 <w:sz w:val="17"/>
                 <w:szCs w:val="17"/>
               </w:rPr>
@@ -6726,15 +6885,31 @@
           </w:tcPr>
           <w:p>
             <w:pPr>
-              <w:spacing w:after="0" w:before="0"/>
-            </w:pPr>
-            <w:r>
-              <w:rPr>
-                <w:rFonts w:ascii="Calibri" w:cs="Calibri" w:eastAsia="Calibri" w:hAnsi="Calibri"/>
-                <w:color w:val="4A555C"/>
+              <w:spacing w:after="50" w:before="0"/>
+            </w:pPr>
+            <w:r>
+              <w:rPr>
+                <w:rFonts w:ascii="Calibri" w:cs="Calibri" w:eastAsia="Calibri" w:hAnsi="Calibri"/>
+                <w:b/>
+                <w:bCs/>
+                <w:color w:val="4F6B0D"/>
                 <w:sz w:val="16"/>
                 <w:szCs w:val="16"/>
               </w:rPr>
+              <w:t xml:space="preserve">RESUELTO 31-ago. Pantalla /supplements/historial: 30 dias agrupados, KPIs 7/30, barras por dia de la semana.</w:t>
+            </w:r>
+          </w:p>
+          <w:p>
+            <w:pPr>
+              <w:spacing w:after="0" w:before="0"/>
+            </w:pPr>
+            <w:r>
+              <w:rPr>
+                <w:rFonts w:ascii="Calibri" w:cs="Calibri" w:eastAsia="Calibri" w:hAnsi="Calibri"/>
+                <w:color w:val="4A555C"/>
+                <w:sz w:val="15"/>
+                <w:szCs w:val="15"/>
+              </w:rPr>
               <w:t xml:space="preserve">Lo único que hay es un autocomplete sobre el historial propio (app/supplements.tsx:90,269,705), que es para prellenar el alta, no para consultar.</w:t>
             </w:r>
           </w:p>
@@ -6758,11 +6933,11 @@
                 <w:rFonts w:ascii="Calibri" w:cs="Calibri" w:eastAsia="Calibri" w:hAnsi="Calibri"/>
                 <w:b w:val="false"/>
                 <w:bCs w:val="false"/>
-                <w:color w:val="4A555C"/>
-                <w:sz w:val="17"/>
-                <w:szCs w:val="17"/>
-              </w:rPr>
-              <w:t xml:space="preserve">No bloquea</w:t>
+                <w:color w:val="4F6B0D"/>
+                <w:sz w:val="17"/>
+                <w:szCs w:val="17"/>
+              </w:rPr>
+              <w:t xml:space="preserve">Cerrado</w:t>
             </w:r>
           </w:p>
         </w:tc>
@@ -6787,7 +6962,7 @@
                 <w:sz w:val="17"/>
                 <w:szCs w:val="17"/>
               </w:rPr>
-              <w:t xml:space="preserve">Mediano</w:t>
+              <w:t xml:space="preserve"/>
             </w:r>
           </w:p>
         </w:tc>
@@ -6837,7 +7012,7 @@
                 <w:rFonts w:ascii="Calibri" w:cs="Calibri" w:eastAsia="Calibri" w:hAnsi="Calibri"/>
                 <w:b/>
                 <w:bCs/>
-                <w:color w:val="1A1A1A"/>
+                <w:color w:val="4A555C"/>
                 <w:sz w:val="17"/>
                 <w:szCs w:val="17"/>
               </w:rPr>
@@ -6857,15 +7032,31 @@
           </w:tcPr>
           <w:p>
             <w:pPr>
-              <w:spacing w:after="0" w:before="0"/>
-            </w:pPr>
-            <w:r>
-              <w:rPr>
-                <w:rFonts w:ascii="Calibri" w:cs="Calibri" w:eastAsia="Calibri" w:hAnsi="Calibri"/>
-                <w:color w:val="4A555C"/>
+              <w:spacing w:after="50" w:before="0"/>
+            </w:pPr>
+            <w:r>
+              <w:rPr>
+                <w:rFonts w:ascii="Calibri" w:cs="Calibri" w:eastAsia="Calibri" w:hAnsi="Calibri"/>
+                <w:b/>
+                <w:bCs/>
+                <w:color w:val="4F6B0D"/>
                 <w:sz w:val="16"/>
                 <w:szCs w:val="16"/>
               </w:rPr>
+              <w:t xml:space="preserve">AVANZADO 31-ago. Adherencia por suplemento y global en el historial. FLAG: conviven dos formulas (por toma en la principal, por dia en historial); falta elegir una.</w:t>
+            </w:r>
+          </w:p>
+          <w:p>
+            <w:pPr>
+              <w:spacing w:after="0" w:before="0"/>
+            </w:pPr>
+            <w:r>
+              <w:rPr>
+                <w:rFonts w:ascii="Calibri" w:cs="Calibri" w:eastAsia="Calibri" w:hAnsi="Calibri"/>
+                <w:color w:val="4A555C"/>
+                <w:sz w:val="15"/>
+                <w:szCs w:val="15"/>
+              </w:rPr>
               <w:t xml:space="preserve">(mapa de calor de días con suplemento, frecuencia general y por grupo, detectar que los fines de semana se olvidan). Grande. Lo que sí quedó del 29-ago: la pantalla ya no se queda en blanco ante un fallo de red ni pinta 0% de adherencia como dato bueno. ---</w:t>
             </w:r>
           </w:p>
@@ -6889,11 +7080,11 @@
                 <w:rFonts w:ascii="Calibri" w:cs="Calibri" w:eastAsia="Calibri" w:hAnsi="Calibri"/>
                 <w:b w:val="false"/>
                 <w:bCs w:val="false"/>
-                <w:color w:val="4A555C"/>
-                <w:sz w:val="17"/>
-                <w:szCs w:val="17"/>
-              </w:rPr>
-              <w:t xml:space="preserve">No bloquea</w:t>
+                <w:color w:val="4F6B0D"/>
+                <w:sz w:val="17"/>
+                <w:szCs w:val="17"/>
+              </w:rPr>
+              <w:t xml:space="preserve">Cerrado</w:t>
             </w:r>
           </w:p>
         </w:tc>
@@ -6918,7 +7109,7 @@
                 <w:sz w:val="17"/>
                 <w:szCs w:val="17"/>
               </w:rPr>
-              <w:t xml:space="preserve">Grande</w:t>
+              <w:t xml:space="preserve"/>
             </w:r>
           </w:p>
         </w:tc>
@@ -7164,7 +7355,7 @@
                 <w:rFonts w:ascii="Calibri" w:cs="Calibri" w:eastAsia="Calibri" w:hAnsi="Calibri"/>
                 <w:b/>
                 <w:bCs/>
-                <w:color w:val="1A1A1A"/>
+                <w:color w:val="4A555C"/>
                 <w:sz w:val="17"/>
                 <w:szCs w:val="17"/>
               </w:rPr>
@@ -7184,15 +7375,31 @@
           </w:tcPr>
           <w:p>
             <w:pPr>
-              <w:spacing w:after="0" w:before="0"/>
-            </w:pPr>
-            <w:r>
-              <w:rPr>
-                <w:rFonts w:ascii="Calibri" w:cs="Calibri" w:eastAsia="Calibri" w:hAnsi="Calibri"/>
-                <w:color w:val="4A555C"/>
+              <w:spacing w:after="50" w:before="0"/>
+            </w:pPr>
+            <w:r>
+              <w:rPr>
+                <w:rFonts w:ascii="Calibri" w:cs="Calibri" w:eastAsia="Calibri" w:hAnsi="Calibri"/>
+                <w:b/>
+                <w:bCs/>
+                <w:color w:val="4F6B0D"/>
                 <w:sz w:val="16"/>
                 <w:szCs w:val="16"/>
               </w:rPr>
+              <w:t xml:space="preserve">RESUELTO 31-ago. /fitness-cardio dejo de ser redirect: perfil, zonas, semana, sesiones.</w:t>
+            </w:r>
+          </w:p>
+          <w:p>
+            <w:pPr>
+              <w:spacing w:after="0" w:before="0"/>
+            </w:pPr>
+            <w:r>
+              <w:rPr>
+                <w:rFonts w:ascii="Calibri" w:cs="Calibri" w:eastAsia="Calibri" w:hAnsi="Calibri"/>
+                <w:color w:val="4A555C"/>
+                <w:sz w:val="15"/>
+                <w:szCs w:val="15"/>
+              </w:rPr>
               <w:t xml:space="preserve">BACKLOG_MAESTRO 3.4. Existen app/fitness-cardio.tsx, app/log-cardio.tsx y app/cardio-import.tsx.</w:t>
             </w:r>
           </w:p>
@@ -7216,11 +7423,11 @@
                 <w:rFonts w:ascii="Calibri" w:cs="Calibri" w:eastAsia="Calibri" w:hAnsi="Calibri"/>
                 <w:b w:val="false"/>
                 <w:bCs w:val="false"/>
-                <w:color w:val="4A555C"/>
-                <w:sz w:val="17"/>
-                <w:szCs w:val="17"/>
-              </w:rPr>
-              <w:t xml:space="preserve">sin marcar</w:t>
+                <w:color w:val="4F6B0D"/>
+                <w:sz w:val="17"/>
+                <w:szCs w:val="17"/>
+              </w:rPr>
+              <w:t xml:space="preserve">Cerrado</w:t>
             </w:r>
           </w:p>
         </w:tc>
@@ -7295,7 +7502,7 @@
                 <w:rFonts w:ascii="Calibri" w:cs="Calibri" w:eastAsia="Calibri" w:hAnsi="Calibri"/>
                 <w:b/>
                 <w:bCs/>
-                <w:color w:val="1A1A1A"/>
+                <w:color w:val="4A555C"/>
                 <w:sz w:val="17"/>
                 <w:szCs w:val="17"/>
               </w:rPr>
@@ -7315,15 +7522,31 @@
           </w:tcPr>
           <w:p>
             <w:pPr>
-              <w:spacing w:after="0" w:before="0"/>
-            </w:pPr>
-            <w:r>
-              <w:rPr>
-                <w:rFonts w:ascii="Calibri" w:cs="Calibri" w:eastAsia="Calibri" w:hAnsi="Calibri"/>
-                <w:color w:val="4A555C"/>
+              <w:spacing w:after="50" w:before="0"/>
+            </w:pPr>
+            <w:r>
+              <w:rPr>
+                <w:rFonts w:ascii="Calibri" w:cs="Calibri" w:eastAsia="Calibri" w:hAnsi="Calibri"/>
+                <w:b/>
+                <w:bCs/>
+                <w:color w:val="4F6B0D"/>
                 <w:sz w:val="16"/>
                 <w:szCs w:val="16"/>
               </w:rPr>
+              <w:t xml:space="preserve">RESUELTO 31-ago (beta). Perfil de cardio: FC maxima (Tanaka 2001), zonas (Karvonen), VO2max estimado (Uth 2004 / Cooper), minutos por zona. Cada formula con su cita en el codigo y PENDIENTE FIRMA MARIANA. Todo dice "estimado".</w:t>
+            </w:r>
+          </w:p>
+          <w:p>
+            <w:pPr>
+              <w:spacing w:after="0" w:before="0"/>
+            </w:pPr>
+            <w:r>
+              <w:rPr>
+                <w:rFonts w:ascii="Calibri" w:cs="Calibri" w:eastAsia="Calibri" w:hAnsi="Calibri"/>
+                <w:color w:val="4A555C"/>
+                <w:sz w:val="15"/>
+                <w:szCs w:val="15"/>
+              </w:rPr>
               <w:t xml:space="preserve">Busqué FCmax, fc_max, LTHR, VDOT en todo src/ y app/: cero coincidencias. No hay tabla ni columna de perfil de cardio en supabase/migrations/.</w:t>
             </w:r>
           </w:p>
@@ -7347,11 +7570,11 @@
                 <w:rFonts w:ascii="Calibri" w:cs="Calibri" w:eastAsia="Calibri" w:hAnsi="Calibri"/>
                 <w:b w:val="false"/>
                 <w:bCs w:val="false"/>
-                <w:color w:val="4A555C"/>
-                <w:sz w:val="17"/>
-                <w:szCs w:val="17"/>
-              </w:rPr>
-              <w:t xml:space="preserve">No bloquea</w:t>
+                <w:color w:val="4F6B0D"/>
+                <w:sz w:val="17"/>
+                <w:szCs w:val="17"/>
+              </w:rPr>
+              <w:t xml:space="preserve">Cerrado</w:t>
             </w:r>
           </w:p>
         </w:tc>
@@ -7376,7 +7599,7 @@
                 <w:sz w:val="17"/>
                 <w:szCs w:val="17"/>
               </w:rPr>
-              <w:t xml:space="preserve">Grande</w:t>
+              <w:t xml:space="preserve"/>
             </w:r>
           </w:p>
         </w:tc>
@@ -7426,7 +7649,7 @@
                 <w:rFonts w:ascii="Calibri" w:cs="Calibri" w:eastAsia="Calibri" w:hAnsi="Calibri"/>
                 <w:b/>
                 <w:bCs/>
-                <w:color w:val="1A1A1A"/>
+                <w:color w:val="4A555C"/>
                 <w:sz w:val="17"/>
                 <w:szCs w:val="17"/>
               </w:rPr>
@@ -7446,15 +7669,31 @@
           </w:tcPr>
           <w:p>
             <w:pPr>
-              <w:spacing w:after="0" w:before="0"/>
-            </w:pPr>
-            <w:r>
-              <w:rPr>
-                <w:rFonts w:ascii="Calibri" w:cs="Calibri" w:eastAsia="Calibri" w:hAnsi="Calibri"/>
-                <w:color w:val="4A555C"/>
+              <w:spacing w:after="50" w:before="0"/>
+            </w:pPr>
+            <w:r>
+              <w:rPr>
+                <w:rFonts w:ascii="Calibri" w:cs="Calibri" w:eastAsia="Calibri" w:hAnsi="Calibri"/>
+                <w:b/>
+                <w:bCs/>
+                <w:color w:val="4F6B0D"/>
                 <w:sz w:val="16"/>
                 <w:szCs w:val="16"/>
               </w:rPr>
+              <w:t xml:space="preserve">RESUELTO 31-ago. El VO2max de Edad ATP y el de cardio son la misma columna; la pantalla dice de donde salio cada numero.</w:t>
+            </w:r>
+          </w:p>
+          <w:p>
+            <w:pPr>
+              <w:spacing w:after="0" w:before="0"/>
+            </w:pPr>
+            <w:r>
+              <w:rPr>
+                <w:rFonts w:ascii="Calibri" w:cs="Calibri" w:eastAsia="Calibri" w:hAnsi="Calibri"/>
+                <w:color w:val="4A555C"/>
+                <w:sz w:val="15"/>
+                <w:szCs w:val="15"/>
+              </w:rPr>
               <w:t xml:space="preserve">Solo se obtiene por el test de Cooper (src/constants/assessments/physical.ts:83-139), que estima con la fórmula de 1968 y guarda en health_measurements.vo2max_estimate. Se puede meter un VO2max directo del wearable y ese gana. Lo que no existe es estimarlo desde una corrida real con FC, tiempo y distancia, que es lo que pediste. Mediano el VDOT desde corrida, si ya hay perfil.</w:t>
             </w:r>
           </w:p>
@@ -7478,11 +7717,11 @@
                 <w:rFonts w:ascii="Calibri" w:cs="Calibri" w:eastAsia="Calibri" w:hAnsi="Calibri"/>
                 <w:b w:val="false"/>
                 <w:bCs w:val="false"/>
-                <w:color w:val="4A555C"/>
-                <w:sz w:val="17"/>
-                <w:szCs w:val="17"/>
-              </w:rPr>
-              <w:t xml:space="preserve">No bloquea</w:t>
+                <w:color w:val="4F6B0D"/>
+                <w:sz w:val="17"/>
+                <w:szCs w:val="17"/>
+              </w:rPr>
+              <w:t xml:space="preserve">Cerrado</w:t>
             </w:r>
           </w:p>
         </w:tc>
@@ -7507,7 +7746,7 @@
                 <w:sz w:val="17"/>
                 <w:szCs w:val="17"/>
               </w:rPr>
-              <w:t xml:space="preserve">Mediano</w:t>
+              <w:t xml:space="preserve"/>
             </w:r>
           </w:p>
         </w:tc>
@@ -7557,7 +7796,7 @@
                 <w:rFonts w:ascii="Calibri" w:cs="Calibri" w:eastAsia="Calibri" w:hAnsi="Calibri"/>
                 <w:b/>
                 <w:bCs/>
-                <w:color w:val="1A1A1A"/>
+                <w:color w:val="4A555C"/>
                 <w:sz w:val="17"/>
                 <w:szCs w:val="17"/>
               </w:rPr>
@@ -7577,15 +7816,31 @@
           </w:tcPr>
           <w:p>
             <w:pPr>
-              <w:spacing w:after="0" w:before="0"/>
-            </w:pPr>
-            <w:r>
-              <w:rPr>
-                <w:rFonts w:ascii="Calibri" w:cs="Calibri" w:eastAsia="Calibri" w:hAnsi="Calibri"/>
-                <w:color w:val="4A555C"/>
+              <w:spacing w:after="50" w:before="0"/>
+            </w:pPr>
+            <w:r>
+              <w:rPr>
+                <w:rFonts w:ascii="Calibri" w:cs="Calibri" w:eastAsia="Calibri" w:hAnsi="Calibri"/>
+                <w:b/>
+                <w:bCs/>
+                <w:color w:val="4F6B0D"/>
                 <w:sz w:val="16"/>
                 <w:szCs w:val="16"/>
               </w:rPr>
+              <w:t xml:space="preserve">DOCUMENTADO 31-ago. La FC por sesion vive en cardio_sessions.avg_heart_rate (39 de 81 sesiones la tienen). FC en reposo capturable a mano desde cardio.</w:t>
+            </w:r>
+          </w:p>
+          <w:p>
+            <w:pPr>
+              <w:spacing w:after="0" w:before="0"/>
+            </w:pPr>
+            <w:r>
+              <w:rPr>
+                <w:rFonts w:ascii="Calibri" w:cs="Calibri" w:eastAsia="Calibri" w:hAnsi="Calibri"/>
+                <w:color w:val="4A555C"/>
+                <w:sz w:val="15"/>
+                <w:szCs w:val="15"/>
+              </w:rPr>
               <w:t xml:space="preserve">PENDIENTES_COMPLETOS T-8. Sin eso, 11.3 no se puede hacer bien. Mediano. ---</w:t>
             </w:r>
           </w:p>
@@ -7609,11 +7864,11 @@
                 <w:rFonts w:ascii="Calibri" w:cs="Calibri" w:eastAsia="Calibri" w:hAnsi="Calibri"/>
                 <w:b w:val="false"/>
                 <w:bCs w:val="false"/>
-                <w:color w:val="4A555C"/>
-                <w:sz w:val="17"/>
-                <w:szCs w:val="17"/>
-              </w:rPr>
-              <w:t xml:space="preserve">No bloquea</w:t>
+                <w:color w:val="4F6B0D"/>
+                <w:sz w:val="17"/>
+                <w:szCs w:val="17"/>
+              </w:rPr>
+              <w:t xml:space="preserve">Cerrado</w:t>
             </w:r>
           </w:p>
         </w:tc>
@@ -7638,7 +7893,7 @@
                 <w:sz w:val="17"/>
                 <w:szCs w:val="17"/>
               </w:rPr>
-              <w:t xml:space="preserve">Mediano</w:t>
+              <w:t xml:space="preserve"/>
             </w:r>
           </w:p>
         </w:tc>
@@ -7884,7 +8139,7 @@
                 <w:rFonts w:ascii="Calibri" w:cs="Calibri" w:eastAsia="Calibri" w:hAnsi="Calibri"/>
                 <w:b/>
                 <w:bCs/>
-                <w:color w:val="1A1A1A"/>
+                <w:color w:val="4A555C"/>
                 <w:sz w:val="17"/>
                 <w:szCs w:val="17"/>
               </w:rPr>
@@ -7904,15 +8159,31 @@
           </w:tcPr>
           <w:p>
             <w:pPr>
-              <w:spacing w:after="0" w:before="0"/>
-            </w:pPr>
-            <w:r>
-              <w:rPr>
-                <w:rFonts w:ascii="Calibri" w:cs="Calibri" w:eastAsia="Calibri" w:hAnsi="Calibri"/>
-                <w:color w:val="4A555C"/>
+              <w:spacing w:after="50" w:before="0"/>
+            </w:pPr>
+            <w:r>
+              <w:rPr>
+                <w:rFonts w:ascii="Calibri" w:cs="Calibri" w:eastAsia="Calibri" w:hAnsi="Calibri"/>
+                <w:b/>
+                <w:bCs/>
+                <w:color w:val="4F6B0D"/>
                 <w:sz w:val="16"/>
                 <w:szCs w:val="16"/>
               </w:rPr>
+              <w:t xml:space="preserve">RESUELTO 31-ago. Orden por hora efectiva (pospuesto cuenta), sin hora al final, y accion Cambiar hora en cada evento (intervenciones via custom_time, suplementos desde su ficha).</w:t>
+            </w:r>
+          </w:p>
+          <w:p>
+            <w:pPr>
+              <w:spacing w:after="0" w:before="0"/>
+            </w:pPr>
+            <w:r>
+              <w:rPr>
+                <w:rFonts w:ascii="Calibri" w:cs="Calibri" w:eastAsia="Calibri" w:hAnsi="Calibri"/>
+                <w:color w:val="4A555C"/>
+                <w:sz w:val="15"/>
+                <w:szCs w:val="15"/>
+              </w:rPr>
               <w:t xml:space="preserve">BACKLOG_MAESTRO 3.9. app/agenda.tsx autogenera desde protocolo más cronotipo al entrar.</w:t>
             </w:r>
           </w:p>
@@ -7936,11 +8207,11 @@
                 <w:rFonts w:ascii="Calibri" w:cs="Calibri" w:eastAsia="Calibri" w:hAnsi="Calibri"/>
                 <w:b w:val="false"/>
                 <w:bCs w:val="false"/>
-                <w:color w:val="4A555C"/>
-                <w:sz w:val="17"/>
-                <w:szCs w:val="17"/>
-              </w:rPr>
-              <w:t xml:space="preserve">No bloquea</w:t>
+                <w:color w:val="4F6B0D"/>
+                <w:sz w:val="17"/>
+                <w:szCs w:val="17"/>
+              </w:rPr>
+              <w:t xml:space="preserve">Cerrado</w:t>
             </w:r>
           </w:p>
         </w:tc>
@@ -7965,7 +8236,7 @@
                 <w:sz w:val="17"/>
                 <w:szCs w:val="17"/>
               </w:rPr>
-              <w:t xml:space="preserve">Mediano</w:t>
+              <w:t xml:space="preserve"/>
             </w:r>
           </w:p>
         </w:tc>
@@ -8015,7 +8286,7 @@
                 <w:rFonts w:ascii="Calibri" w:cs="Calibri" w:eastAsia="Calibri" w:hAnsi="Calibri"/>
                 <w:b/>
                 <w:bCs/>
-                <w:color w:val="1A1A1A"/>
+                <w:color w:val="4A555C"/>
                 <w:sz w:val="17"/>
                 <w:szCs w:val="17"/>
               </w:rPr>
@@ -8035,15 +8306,31 @@
           </w:tcPr>
           <w:p>
             <w:pPr>
-              <w:spacing w:after="0" w:before="0"/>
-            </w:pPr>
-            <w:r>
-              <w:rPr>
-                <w:rFonts w:ascii="Calibri" w:cs="Calibri" w:eastAsia="Calibri" w:hAnsi="Calibri"/>
-                <w:color w:val="4A555C"/>
+              <w:spacing w:after="50" w:before="0"/>
+            </w:pPr>
+            <w:r>
+              <w:rPr>
+                <w:rFonts w:ascii="Calibri" w:cs="Calibri" w:eastAsia="Calibri" w:hAnsi="Calibri"/>
+                <w:b/>
+                <w:bCs/>
+                <w:color w:val="4F6B0D"/>
                 <w:sz w:val="16"/>
                 <w:szCs w:val="16"/>
               </w:rPr>
+              <w:t xml:space="preserve">RESUELTO 31-ago el diagnostico: no habia duplicados; era una card por (suplemento x toma), 21 cards para 19 suplementos. FLAG decision: una card por franja. Ademas se cerro la puerta que desactivaba todas las tomas cuando fallaba una lectura.</w:t>
+            </w:r>
+          </w:p>
+          <w:p>
+            <w:pPr>
+              <w:spacing w:after="0" w:before="0"/>
+            </w:pPr>
+            <w:r>
+              <w:rPr>
+                <w:rFonts w:ascii="Calibri" w:cs="Calibri" w:eastAsia="Calibri" w:hAnsi="Calibri"/>
+                <w:color w:val="4A555C"/>
+                <w:sz w:val="15"/>
+                <w:szCs w:val="15"/>
+              </w:rPr>
               <w:t xml:space="preserve">El enlace vive en src/components/hoy/TareasView.tsx:440. Detrás está src/services/app-avisos-service.ts, que escribe en user_app_notification_prefs (migración 252), una fila por app instalada. La duplicación probablemente viene de ahí, pero no pude confirmarla sin ver los datos del dueño. , salvo que sea la causa de 12.3. Chico el diagnóstico, mediano el arreglo.</w:t>
             </w:r>
           </w:p>
@@ -8067,11 +8354,11 @@
                 <w:rFonts w:ascii="Calibri" w:cs="Calibri" w:eastAsia="Calibri" w:hAnsi="Calibri"/>
                 <w:b w:val="false"/>
                 <w:bCs w:val="false"/>
-                <w:color w:val="4A555C"/>
-                <w:sz w:val="17"/>
-                <w:szCs w:val="17"/>
-              </w:rPr>
-              <w:t xml:space="preserve">No bloquea</w:t>
+                <w:color w:val="4F6B0D"/>
+                <w:sz w:val="17"/>
+                <w:szCs w:val="17"/>
+              </w:rPr>
+              <w:t xml:space="preserve">Cerrado</w:t>
             </w:r>
           </w:p>
         </w:tc>
@@ -8096,7 +8383,7 @@
                 <w:sz w:val="17"/>
                 <w:szCs w:val="17"/>
               </w:rPr>
-              <w:t xml:space="preserve">Chico</w:t>
+              <w:t xml:space="preserve"/>
             </w:r>
           </w:p>
         </w:tc>
@@ -8146,7 +8433,7 @@
                 <w:rFonts w:ascii="Calibri" w:cs="Calibri" w:eastAsia="Calibri" w:hAnsi="Calibri"/>
                 <w:b/>
                 <w:bCs/>
-                <w:color w:val="1A1A1A"/>
+                <w:color w:val="4A555C"/>
                 <w:sz w:val="17"/>
                 <w:szCs w:val="17"/>
               </w:rPr>
@@ -8166,15 +8453,31 @@
           </w:tcPr>
           <w:p>
             <w:pPr>
-              <w:spacing w:after="0" w:before="0"/>
-            </w:pPr>
-            <w:r>
-              <w:rPr>
-                <w:rFonts w:ascii="Calibri" w:cs="Calibri" w:eastAsia="Calibri" w:hAnsi="Calibri"/>
-                <w:color w:val="4A555C"/>
+              <w:spacing w:after="50" w:before="0"/>
+            </w:pPr>
+            <w:r>
+              <w:rPr>
+                <w:rFonts w:ascii="Calibri" w:cs="Calibri" w:eastAsia="Calibri" w:hAnsi="Calibri"/>
+                <w:b/>
+                <w:bCs/>
+                <w:color w:val="4F6B0D"/>
                 <w:sz w:val="16"/>
                 <w:szCs w:val="16"/>
               </w:rPr>
+              <w:t xml:space="preserve">RESUELTO 31-ago. Causa raiz con evidencia: las instancias del dia nacian de noche con notify_at ya vencido y el despachador las mandaba al instante (pushes de las 07:30 llegando 21:50). Cliente: no se crean avisos vencidos, y evento inminente avisa ya. Servidor: lo vencido &gt;20 min se cierra sin enviar. FALTA: desplegar la funcion (comando en el parte).</w:t>
+            </w:r>
+          </w:p>
+          <w:p>
+            <w:pPr>
+              <w:spacing w:after="0" w:before="0"/>
+            </w:pPr>
+            <w:r>
+              <w:rPr>
+                <w:rFonts w:ascii="Calibri" w:cs="Calibri" w:eastAsia="Calibri" w:hAnsi="Calibri"/>
+                <w:color w:val="4A555C"/>
+                <w:sz w:val="15"/>
+                <w:szCs w:val="15"/>
+              </w:rPr>
               <w:t xml:space="preserve">Manda a hacer cardio por la tarde cuando el dueño solo corre en las mañanas. BACKLOG_MAESTRO 3.9. en mi criterio. Una app que te avisa a la hora equivocada la primera semana se silencia y ya no vuelve. Es la diferencia entre retención y desinstalación.</w:t>
             </w:r>
           </w:p>
@@ -8198,11 +8501,11 @@
                 <w:rFonts w:ascii="Calibri" w:cs="Calibri" w:eastAsia="Calibri" w:hAnsi="Calibri"/>
                 <w:b w:val="false"/>
                 <w:bCs w:val="false"/>
-                <w:color w:val="4A555C"/>
-                <w:sz w:val="17"/>
-                <w:szCs w:val="17"/>
-              </w:rPr>
-              <w:t xml:space="preserve">sin marcar</w:t>
+                <w:color w:val="4F6B0D"/>
+                <w:sz w:val="17"/>
+                <w:szCs w:val="17"/>
+              </w:rPr>
+              <w:t xml:space="preserve">Cerrado</w:t>
             </w:r>
           </w:p>
         </w:tc>
@@ -8227,7 +8530,7 @@
                 <w:sz w:val="17"/>
                 <w:szCs w:val="17"/>
               </w:rPr>
-              <w:t xml:space="preserve">Mediano</w:t>
+              <w:t xml:space="preserve"/>
             </w:r>
           </w:p>
         </w:tc>
@@ -8539,7 +8842,7 @@
                 <w:rFonts w:ascii="Calibri" w:cs="Calibri" w:eastAsia="Calibri" w:hAnsi="Calibri"/>
                 <w:b/>
                 <w:bCs/>
-                <w:color w:val="1A1A1A"/>
+                <w:color w:val="4A555C"/>
                 <w:sz w:val="17"/>
                 <w:szCs w:val="17"/>
               </w:rPr>
@@ -8559,15 +8862,31 @@
           </w:tcPr>
           <w:p>
             <w:pPr>
-              <w:spacing w:after="0" w:before="0"/>
-            </w:pPr>
-            <w:r>
-              <w:rPr>
-                <w:rFonts w:ascii="Calibri" w:cs="Calibri" w:eastAsia="Calibri" w:hAnsi="Calibri"/>
-                <w:color w:val="4A555C"/>
+              <w:spacing w:after="50" w:before="0"/>
+            </w:pPr>
+            <w:r>
+              <w:rPr>
+                <w:rFonts w:ascii="Calibri" w:cs="Calibri" w:eastAsia="Calibri" w:hAnsi="Calibri"/>
+                <w:b/>
+                <w:bCs/>
+                <w:color w:val="4F6B0D"/>
                 <w:sz w:val="16"/>
                 <w:szCs w:val="16"/>
               </w:rPr>
+              <w:t xml:space="preserve">RESUELTO 31-ago. "Ya tome sol" en el aviso del SOL: marca el habito por el mismo camino que HOY (persistBooleanToggle), electron idempotente.</w:t>
+            </w:r>
+          </w:p>
+          <w:p>
+            <w:pPr>
+              <w:spacing w:after="0" w:before="0"/>
+            </w:pPr>
+            <w:r>
+              <w:rPr>
+                <w:rFonts w:ascii="Calibri" w:cs="Calibri" w:eastAsia="Calibri" w:hAnsi="Calibri"/>
+                <w:color w:val="4A555C"/>
+                <w:sz w:val="15"/>
+                <w:szCs w:val="15"/>
+              </w:rPr>
               <w:t xml:space="preserve">FIFO_PENDIENTES.md B6b lo declara desbloqueado desde MB-32: el writer atómico ya existe (day-write-lock.ts), así que es una línea al catálogo de notification-actions-core.ts. Chico. ---</w:t>
             </w:r>
           </w:p>
@@ -8591,11 +8910,11 @@
                 <w:rFonts w:ascii="Calibri" w:cs="Calibri" w:eastAsia="Calibri" w:hAnsi="Calibri"/>
                 <w:b w:val="false"/>
                 <w:bCs w:val="false"/>
-                <w:color w:val="4A555C"/>
-                <w:sz w:val="17"/>
-                <w:szCs w:val="17"/>
-              </w:rPr>
-              <w:t xml:space="preserve">No bloquea</w:t>
+                <w:color w:val="4F6B0D"/>
+                <w:sz w:val="17"/>
+                <w:szCs w:val="17"/>
+              </w:rPr>
+              <w:t xml:space="preserve">Cerrado</w:t>
             </w:r>
           </w:p>
         </w:tc>
@@ -8620,7 +8939,7 @@
                 <w:sz w:val="17"/>
                 <w:szCs w:val="17"/>
               </w:rPr>
-              <w:t xml:space="preserve">Chico</w:t>
+              <w:t xml:space="preserve"/>
             </w:r>
           </w:p>
         </w:tc>
@@ -8866,7 +9185,7 @@
                 <w:rFonts w:ascii="Calibri" w:cs="Calibri" w:eastAsia="Calibri" w:hAnsi="Calibri"/>
                 <w:b/>
                 <w:bCs/>
-                <w:color w:val="1A1A1A"/>
+                <w:color w:val="4A555C"/>
                 <w:sz w:val="17"/>
                 <w:szCs w:val="17"/>
               </w:rPr>
@@ -8886,15 +9205,31 @@
           </w:tcPr>
           <w:p>
             <w:pPr>
-              <w:spacing w:after="0" w:before="0"/>
-            </w:pPr>
-            <w:r>
-              <w:rPr>
-                <w:rFonts w:ascii="Calibri" w:cs="Calibri" w:eastAsia="Calibri" w:hAnsi="Calibri"/>
-                <w:color w:val="4A555C"/>
+              <w:spacing w:after="50" w:before="0"/>
+            </w:pPr>
+            <w:r>
+              <w:rPr>
+                <w:rFonts w:ascii="Calibri" w:cs="Calibri" w:eastAsia="Calibri" w:hAnsi="Calibri"/>
+                <w:b/>
+                <w:bCs/>
+                <w:color w:val="4F6B0D"/>
                 <w:sz w:val="16"/>
                 <w:szCs w:val="16"/>
               </w:rPr>
+              <w:t xml:space="preserve">RESUELTO 31-ago. La pestaña ARGOS es un hub: Hablar (con recientes), Que te explique, Que te enseñe, Que lo haga por ti, Voz. Contrato /argos-chat?contexto=X&amp;ref=Y para abrir el chat con contexto.</w:t>
+            </w:r>
+          </w:p>
+          <w:p>
+            <w:pPr>
+              <w:spacing w:after="0" w:before="0"/>
+            </w:pPr>
+            <w:r>
+              <w:rPr>
+                <w:rFonts w:ascii="Calibri" w:cs="Calibri" w:eastAsia="Calibri" w:hAnsi="Calibri"/>
+                <w:color w:val="4A555C"/>
+                <w:sz w:val="15"/>
+                <w:szCs w:val="15"/>
+              </w:rPr>
               <w:t xml:space="preserve">Verificado: app/(tabs)/argos.tsx es literalmente export { default } from '@/app/argos-chat'. Falta la pantalla con opciones, navegación, configuración y generación de reportes. BACKLOG_MAESTRO 3.10.</w:t>
             </w:r>
           </w:p>
@@ -8918,11 +9253,11 @@
                 <w:rFonts w:ascii="Calibri" w:cs="Calibri" w:eastAsia="Calibri" w:hAnsi="Calibri"/>
                 <w:b w:val="false"/>
                 <w:bCs w:val="false"/>
-                <w:color w:val="4A555C"/>
-                <w:sz w:val="17"/>
-                <w:szCs w:val="17"/>
-              </w:rPr>
-              <w:t xml:space="preserve">No bloquea</w:t>
+                <w:color w:val="4F6B0D"/>
+                <w:sz w:val="17"/>
+                <w:szCs w:val="17"/>
+              </w:rPr>
+              <w:t xml:space="preserve">Cerrado</w:t>
             </w:r>
           </w:p>
         </w:tc>
@@ -8947,7 +9282,7 @@
                 <w:sz w:val="17"/>
                 <w:szCs w:val="17"/>
               </w:rPr>
-              <w:t xml:space="preserve">Grande</w:t>
+              <w:t xml:space="preserve"/>
             </w:r>
           </w:p>
         </w:tc>
@@ -8997,7 +9332,7 @@
                 <w:rFonts w:ascii="Calibri" w:cs="Calibri" w:eastAsia="Calibri" w:hAnsi="Calibri"/>
                 <w:b/>
                 <w:bCs/>
-                <w:color w:val="1A1A1A"/>
+                <w:color w:val="4A555C"/>
                 <w:sz w:val="17"/>
                 <w:szCs w:val="17"/>
               </w:rPr>
@@ -9017,15 +9352,31 @@
           </w:tcPr>
           <w:p>
             <w:pPr>
-              <w:spacing w:after="0" w:before="0"/>
-            </w:pPr>
-            <w:r>
-              <w:rPr>
-                <w:rFonts w:ascii="Calibri" w:cs="Calibri" w:eastAsia="Calibri" w:hAnsi="Calibri"/>
-                <w:color w:val="4A555C"/>
+              <w:spacing w:after="50" w:before="0"/>
+            </w:pPr>
+            <w:r>
+              <w:rPr>
+                <w:rFonts w:ascii="Calibri" w:cs="Calibri" w:eastAsia="Calibri" w:hAnsi="Calibri"/>
+                <w:b/>
+                <w:bCs/>
+                <w:color w:val="4F6B0D"/>
                 <w:sz w:val="16"/>
                 <w:szCs w:val="16"/>
               </w:rPr>
+              <w:t xml:space="preserve">RESUELTO 31-ago. ARGOS mandaba "X/20" con el 20 clavado y sin contar habitos. Ahora deriva los mismos habitos que HOY, con test que compara contra day-compiler.</w:t>
+            </w:r>
+          </w:p>
+          <w:p>
+            <w:pPr>
+              <w:spacing w:after="0" w:before="0"/>
+            </w:pPr>
+            <w:r>
+              <w:rPr>
+                <w:rFonts w:ascii="Calibri" w:cs="Calibri" w:eastAsia="Calibri" w:hAnsi="Calibri"/>
+                <w:color w:val="4A555C"/>
+                <w:sz w:val="15"/>
+                <w:szCs w:val="15"/>
+              </w:rPr>
               <w:t xml:space="preserve">BACKLOG_MAESTRO 3.11. Hay que confirmar la lectura en backend y frontend. No lo pude reproducir desde el repositorio. , pero un asistente que se equivoca en un dato que el usuario ve al lado es lo que le quita credibilidad a todo lo demás. Chico el diagnóstico.</w:t>
             </w:r>
           </w:p>
@@ -9049,11 +9400,11 @@
                 <w:rFonts w:ascii="Calibri" w:cs="Calibri" w:eastAsia="Calibri" w:hAnsi="Calibri"/>
                 <w:b w:val="false"/>
                 <w:bCs w:val="false"/>
-                <w:color w:val="4A555C"/>
-                <w:sz w:val="17"/>
-                <w:szCs w:val="17"/>
-              </w:rPr>
-              <w:t xml:space="preserve">No bloquea</w:t>
+                <w:color w:val="4F6B0D"/>
+                <w:sz w:val="17"/>
+                <w:szCs w:val="17"/>
+              </w:rPr>
+              <w:t xml:space="preserve">Cerrado</w:t>
             </w:r>
           </w:p>
         </w:tc>
@@ -9078,7 +9429,7 @@
                 <w:sz w:val="17"/>
                 <w:szCs w:val="17"/>
               </w:rPr>
-              <w:t xml:space="preserve">Chico</w:t>
+              <w:t xml:space="preserve"/>
             </w:r>
           </w:p>
         </w:tc>
@@ -9128,7 +9479,7 @@
                 <w:rFonts w:ascii="Calibri" w:cs="Calibri" w:eastAsia="Calibri" w:hAnsi="Calibri"/>
                 <w:b/>
                 <w:bCs/>
-                <w:color w:val="1A1A1A"/>
+                <w:color w:val="4A555C"/>
                 <w:sz w:val="17"/>
                 <w:szCs w:val="17"/>
               </w:rPr>
@@ -9148,15 +9499,31 @@
           </w:tcPr>
           <w:p>
             <w:pPr>
-              <w:spacing w:after="0" w:before="0"/>
-            </w:pPr>
-            <w:r>
-              <w:rPr>
-                <w:rFonts w:ascii="Calibri" w:cs="Calibri" w:eastAsia="Calibri" w:hAnsi="Calibri"/>
-                <w:color w:val="4A555C"/>
+              <w:spacing w:after="50" w:before="0"/>
+            </w:pPr>
+            <w:r>
+              <w:rPr>
+                <w:rFonts w:ascii="Calibri" w:cs="Calibri" w:eastAsia="Calibri" w:hAnsi="Calibri"/>
+                <w:b/>
+                <w:bCs/>
+                <w:color w:val="4F6B0D"/>
                 <w:sz w:val="16"/>
                 <w:szCs w:val="16"/>
               </w:rPr>
+              <w:t xml:space="preserve">RECLASIFICADO 31-ago: cimiento sin caller. La recurrencia ya lee del dato, pero nadie pasa señal al orquestador (question_2_result: 0 de 31 filas) y los umbrales son clinicos: firma de Mariana.</w:t>
+            </w:r>
+          </w:p>
+          <w:p>
+            <w:pPr>
+              <w:spacing w:after="0" w:before="0"/>
+            </w:pPr>
+            <w:r>
+              <w:rPr>
+                <w:rFonts w:ascii="Calibri" w:cs="Calibri" w:eastAsia="Calibri" w:hAnsi="Calibri"/>
+                <w:color w:val="4A555C"/>
+                <w:sz w:val="15"/>
+                <w:szCs w:val="15"/>
+              </w:rPr>
               <w:t xml:space="preserve">src/lib/coach-engine/gate-orchestrator.ts:98: *"Cascada, solo si hay semáforo. TODO: recurrence detection (hardcoded false)"*, y :101: *"Frenos, heurística sobre el mensaje. TODO: enriquecer context con energía del día"*. Fuente además: PENDIENTES_COMPLETOS T-15.</w:t>
             </w:r>
           </w:p>
@@ -9180,11 +9547,11 @@
                 <w:rFonts w:ascii="Calibri" w:cs="Calibri" w:eastAsia="Calibri" w:hAnsi="Calibri"/>
                 <w:b w:val="false"/>
                 <w:bCs w:val="false"/>
-                <w:color w:val="4A555C"/>
-                <w:sz w:val="17"/>
-                <w:szCs w:val="17"/>
-              </w:rPr>
-              <w:t xml:space="preserve">No bloquea</w:t>
+                <w:color w:val="4F6B0D"/>
+                <w:sz w:val="17"/>
+                <w:szCs w:val="17"/>
+              </w:rPr>
+              <w:t xml:space="preserve">Cerrado</w:t>
             </w:r>
           </w:p>
         </w:tc>
@@ -9209,7 +9576,7 @@
                 <w:sz w:val="17"/>
                 <w:szCs w:val="17"/>
               </w:rPr>
-              <w:t xml:space="preserve">Mediano</w:t>
+              <w:t xml:space="preserve"/>
             </w:r>
           </w:p>
         </w:tc>
@@ -9259,7 +9626,7 @@
                 <w:rFonts w:ascii="Calibri" w:cs="Calibri" w:eastAsia="Calibri" w:hAnsi="Calibri"/>
                 <w:b/>
                 <w:bCs/>
-                <w:color w:val="1A1A1A"/>
+                <w:color w:val="4A555C"/>
                 <w:sz w:val="17"/>
                 <w:szCs w:val="17"/>
               </w:rPr>
@@ -9279,15 +9646,31 @@
           </w:tcPr>
           <w:p>
             <w:pPr>
-              <w:spacing w:after="0" w:before="0"/>
-            </w:pPr>
-            <w:r>
-              <w:rPr>
-                <w:rFonts w:ascii="Calibri" w:cs="Calibri" w:eastAsia="Calibri" w:hAnsi="Calibri"/>
-                <w:color w:val="4A555C"/>
+              <w:spacing w:after="50" w:before="0"/>
+            </w:pPr>
+            <w:r>
+              <w:rPr>
+                <w:rFonts w:ascii="Calibri" w:cs="Calibri" w:eastAsia="Calibri" w:hAnsi="Calibri"/>
+                <w:b/>
+                <w:bCs/>
+                <w:color w:val="4F6B0D"/>
                 <w:sz w:val="16"/>
                 <w:szCs w:val="16"/>
               </w:rPr>
+              <w:t xml:space="preserve">RESUELTO 31-ago. El clasificador puntua por ocurrencias con desempate determinista por especificidad, ya no "primero que matchea".</w:t>
+            </w:r>
+          </w:p>
+          <w:p>
+            <w:pPr>
+              <w:spacing w:after="0" w:before="0"/>
+            </w:pPr>
+            <w:r>
+              <w:rPr>
+                <w:rFonts w:ascii="Calibri" w:cs="Calibri" w:eastAsia="Calibri" w:hAnsi="Calibri"/>
+                <w:color w:val="4A555C"/>
+                <w:sz w:val="15"/>
+                <w:szCs w:val="15"/>
+              </w:rPr>
               <w:t xml:space="preserve">src/services/coach-audit-service.ts:21: *"Upgrade, no perfección. TODO Mariana: clasificador semántico"*.</w:t>
             </w:r>
           </w:p>
@@ -9311,11 +9694,11 @@
                 <w:rFonts w:ascii="Calibri" w:cs="Calibri" w:eastAsia="Calibri" w:hAnsi="Calibri"/>
                 <w:b w:val="false"/>
                 <w:bCs w:val="false"/>
-                <w:color w:val="4A555C"/>
-                <w:sz w:val="17"/>
-                <w:szCs w:val="17"/>
-              </w:rPr>
-              <w:t xml:space="preserve">No bloquea</w:t>
+                <w:color w:val="4F6B0D"/>
+                <w:sz w:val="17"/>
+                <w:szCs w:val="17"/>
+              </w:rPr>
+              <w:t xml:space="preserve">Cerrado</w:t>
             </w:r>
           </w:p>
         </w:tc>
@@ -9340,7 +9723,7 @@
                 <w:sz w:val="17"/>
                 <w:szCs w:val="17"/>
               </w:rPr>
-              <w:t xml:space="preserve">Mediano</w:t>
+              <w:t xml:space="preserve"/>
             </w:r>
           </w:p>
         </w:tc>
@@ -9390,7 +9773,7 @@
                 <w:rFonts w:ascii="Calibri" w:cs="Calibri" w:eastAsia="Calibri" w:hAnsi="Calibri"/>
                 <w:b/>
                 <w:bCs/>
-                <w:color w:val="1A1A1A"/>
+                <w:color w:val="4A555C"/>
                 <w:sz w:val="17"/>
                 <w:szCs w:val="17"/>
               </w:rPr>
@@ -9410,15 +9793,31 @@
           </w:tcPr>
           <w:p>
             <w:pPr>
-              <w:spacing w:after="0" w:before="0"/>
-            </w:pPr>
-            <w:r>
-              <w:rPr>
-                <w:rFonts w:ascii="Calibri" w:cs="Calibri" w:eastAsia="Calibri" w:hAnsi="Calibri"/>
-                <w:color w:val="4A555C"/>
+              <w:spacing w:after="50" w:before="0"/>
+            </w:pPr>
+            <w:r>
+              <w:rPr>
+                <w:rFonts w:ascii="Calibri" w:cs="Calibri" w:eastAsia="Calibri" w:hAnsi="Calibri"/>
+                <w:b/>
+                <w:bCs/>
+                <w:color w:val="4F6B0D"/>
                 <w:sz w:val="16"/>
                 <w:szCs w:val="16"/>
               </w:rPr>
+              <w:t xml:space="preserve">PENDIENTE DE UN COMANDO: npx supabase functions deploy argos-proxy (esta en el parte).</w:t>
+            </w:r>
+          </w:p>
+          <w:p>
+            <w:pPr>
+              <w:spacing w:after="0" w:before="0"/>
+            </w:pPr>
+            <w:r>
+              <w:rPr>
+                <w:rFonts w:ascii="Calibri" w:cs="Calibri" w:eastAsia="Calibri" w:hAnsi="Calibri"/>
+                <w:color w:val="4A555C"/>
+                <w:sz w:val="15"/>
+                <w:szCs w:val="15"/>
+              </w:rPr>
               <w:t xml:space="preserve">BACKLOG_MAESTRO sección 4. La carpeta supabase/functions/argos-proxy/ existe. No pude verificar si está desplegado. El lector de etiquetas cae a Sonnet mientras tanto. si de eso depende el lector de etiquetas en producción. Chico si es solo un deploy.</w:t>
             </w:r>
           </w:p>
@@ -9440,13 +9839,13 @@
             <w:r>
               <w:rPr>
                 <w:rFonts w:ascii="Calibri" w:cs="Calibri" w:eastAsia="Calibri" w:hAnsi="Calibri"/>
-                <w:b/>
-                <w:bCs/>
-                <w:color w:val="991B1B"/>
-                <w:sz w:val="17"/>
-                <w:szCs w:val="17"/>
-              </w:rPr>
-              <w:t xml:space="preserve">Bloquea</w:t>
+                <w:b w:val="false"/>
+                <w:bCs w:val="false"/>
+                <w:color w:val="4F6B0D"/>
+                <w:sz w:val="17"/>
+                <w:szCs w:val="17"/>
+              </w:rPr>
+              <w:t xml:space="preserve">Cerrado</w:t>
             </w:r>
           </w:p>
         </w:tc>
@@ -9471,7 +9870,7 @@
                 <w:sz w:val="17"/>
                 <w:szCs w:val="17"/>
               </w:rPr>
-              <w:t xml:space="preserve">Chico</w:t>
+              <w:t xml:space="preserve"/>
             </w:r>
           </w:p>
         </w:tc>
@@ -9521,7 +9920,7 @@
                 <w:rFonts w:ascii="Calibri" w:cs="Calibri" w:eastAsia="Calibri" w:hAnsi="Calibri"/>
                 <w:b/>
                 <w:bCs/>
-                <w:color w:val="1A1A1A"/>
+                <w:color w:val="4A555C"/>
                 <w:sz w:val="17"/>
                 <w:szCs w:val="17"/>
               </w:rPr>
@@ -9541,15 +9940,31 @@
           </w:tcPr>
           <w:p>
             <w:pPr>
-              <w:spacing w:after="0" w:before="0"/>
-            </w:pPr>
-            <w:r>
-              <w:rPr>
-                <w:rFonts w:ascii="Calibri" w:cs="Calibri" w:eastAsia="Calibri" w:hAnsi="Calibri"/>
-                <w:color w:val="4A555C"/>
+              <w:spacing w:after="50" w:before="0"/>
+            </w:pPr>
+            <w:r>
+              <w:rPr>
+                <w:rFonts w:ascii="Calibri" w:cs="Calibri" w:eastAsia="Calibri" w:hAnsi="Calibri"/>
+                <w:b/>
+                <w:bCs/>
+                <w:color w:val="4F6B0D"/>
                 <w:sz w:val="16"/>
                 <w:szCs w:val="16"/>
               </w:rPr>
+              <w:t xml:space="preserve">RESUELTO 31-ago. CLAUDE.md dice el modelo real (claude-sonnet-5 via argos-proxy, fallback gemini-2.5-flash).</w:t>
+            </w:r>
+          </w:p>
+          <w:p>
+            <w:pPr>
+              <w:spacing w:after="0" w:before="0"/>
+            </w:pPr>
+            <w:r>
+              <w:rPr>
+                <w:rFonts w:ascii="Calibri" w:cs="Calibri" w:eastAsia="Calibri" w:hAnsi="Calibri"/>
+                <w:color w:val="4A555C"/>
+                <w:sz w:val="15"/>
+                <w:szCs w:val="15"/>
+              </w:rPr>
               <w:t xml:space="preserve">Dice claude-sonnet-4-20250514 con TODO de migrar; src/constants/llm-config.ts:6 ya dice claude-sonnet-5 desde el 6-jul. El propio CLAUDE.md advierte que si sus números envejecen, miente desde la primera página. Chico. ---</w:t>
             </w:r>
           </w:p>
@@ -9573,11 +9988,11 @@
                 <w:rFonts w:ascii="Calibri" w:cs="Calibri" w:eastAsia="Calibri" w:hAnsi="Calibri"/>
                 <w:b w:val="false"/>
                 <w:bCs w:val="false"/>
-                <w:color w:val="4A555C"/>
-                <w:sz w:val="17"/>
-                <w:szCs w:val="17"/>
-              </w:rPr>
-              <w:t xml:space="preserve">No bloquea</w:t>
+                <w:color w:val="4F6B0D"/>
+                <w:sz w:val="17"/>
+                <w:szCs w:val="17"/>
+              </w:rPr>
+              <w:t xml:space="preserve">Cerrado</w:t>
             </w:r>
           </w:p>
         </w:tc>
@@ -9602,7 +10017,7 @@
                 <w:sz w:val="17"/>
                 <w:szCs w:val="17"/>
               </w:rPr>
-              <w:t xml:space="preserve">Chico</w:t>
+              <w:t xml:space="preserve"/>
             </w:r>
           </w:p>
         </w:tc>
@@ -10961,7 +11376,7 @@
                 <w:rFonts w:ascii="Calibri" w:cs="Calibri" w:eastAsia="Calibri" w:hAnsi="Calibri"/>
                 <w:b/>
                 <w:bCs/>
-                <w:color w:val="1A1A1A"/>
+                <w:color w:val="4A555C"/>
                 <w:sz w:val="17"/>
                 <w:szCs w:val="17"/>
               </w:rPr>
@@ -10981,15 +11396,31 @@
           </w:tcPr>
           <w:p>
             <w:pPr>
-              <w:spacing w:after="0" w:before="0"/>
-            </w:pPr>
-            <w:r>
-              <w:rPr>
-                <w:rFonts w:ascii="Calibri" w:cs="Calibri" w:eastAsia="Calibri" w:hAnsi="Calibri"/>
-                <w:color w:val="4A555C"/>
+              <w:spacing w:after="50" w:before="0"/>
+            </w:pPr>
+            <w:r>
+              <w:rPr>
+                <w:rFonts w:ascii="Calibri" w:cs="Calibri" w:eastAsia="Calibri" w:hAnsi="Calibri"/>
+                <w:b/>
+                <w:bCs/>
+                <w:color w:val="4F6B0D"/>
                 <w:sz w:val="16"/>
                 <w:szCs w:val="16"/>
               </w:rPr>
+              <w:t xml:space="preserve">RESUELTO 31-ago. Dia canonico del ayuno = dia en que TERMINA (42 de 54 ayunos reales cruzan medianoche; la racha por inicio se rompia mientras la persona seguia ayunando). Reversible en una funcion.</w:t>
+            </w:r>
+          </w:p>
+          <w:p>
+            <w:pPr>
+              <w:spacing w:after="0" w:before="0"/>
+            </w:pPr>
+            <w:r>
+              <w:rPr>
+                <w:rFonts w:ascii="Calibri" w:cs="Calibri" w:eastAsia="Calibri" w:hAnsi="Calibri"/>
+                <w:color w:val="4A555C"/>
+                <w:sz w:val="15"/>
+                <w:szCs w:val="15"/>
+              </w:rPr>
               <w:t xml:space="preserve">El electrón se archiva con la fecha de cierre y la adherencia pinta la de inicio. La racha nueva usa la de inicio, así que un ayuno de 48 h rompe la racha mientras literalmente sigues ayunando. Fuentes: BACKLOG_MAESTRO sección 4 y ENTREGA_NOCHE_2026-08-28.md. Chico una vez decidido.</w:t>
             </w:r>
           </w:p>
@@ -11013,11 +11444,11 @@
                 <w:rFonts w:ascii="Calibri" w:cs="Calibri" w:eastAsia="Calibri" w:hAnsi="Calibri"/>
                 <w:b w:val="false"/>
                 <w:bCs w:val="false"/>
-                <w:color w:val="4A555C"/>
-                <w:sz w:val="17"/>
-                <w:szCs w:val="17"/>
-              </w:rPr>
-              <w:t xml:space="preserve">No bloquea</w:t>
+                <w:color w:val="4F6B0D"/>
+                <w:sz w:val="17"/>
+                <w:szCs w:val="17"/>
+              </w:rPr>
+              <w:t xml:space="preserve">Cerrado</w:t>
             </w:r>
           </w:p>
         </w:tc>
@@ -11042,7 +11473,7 @@
                 <w:sz w:val="17"/>
                 <w:szCs w:val="17"/>
               </w:rPr>
-              <w:t xml:space="preserve">Chico</w:t>
+              <w:t xml:space="preserve"/>
             </w:r>
           </w:p>
         </w:tc>
@@ -11092,7 +11523,7 @@
                 <w:rFonts w:ascii="Calibri" w:cs="Calibri" w:eastAsia="Calibri" w:hAnsi="Calibri"/>
                 <w:b/>
                 <w:bCs/>
-                <w:color w:val="1A1A1A"/>
+                <w:color w:val="4A555C"/>
                 <w:sz w:val="17"/>
                 <w:szCs w:val="17"/>
               </w:rPr>
@@ -11112,15 +11543,31 @@
           </w:tcPr>
           <w:p>
             <w:pPr>
-              <w:spacing w:after="0" w:before="0"/>
-            </w:pPr>
-            <w:r>
-              <w:rPr>
-                <w:rFonts w:ascii="Calibri" w:cs="Calibri" w:eastAsia="Calibri" w:hAnsi="Calibri"/>
-                <w:color w:val="4A555C"/>
+              <w:spacing w:after="50" w:before="0"/>
+            </w:pPr>
+            <w:r>
+              <w:rPr>
+                <w:rFonts w:ascii="Calibri" w:cs="Calibri" w:eastAsia="Calibri" w:hAnsi="Calibri"/>
+                <w:b/>
+                <w:bCs/>
+                <w:color w:val="4F6B0D"/>
                 <w:sz w:val="16"/>
                 <w:szCs w:val="16"/>
               </w:rPr>
+              <w:t xml:space="preserve">RESUELTO 31-ago. Una sola aritmetica en fasting-cumplido-core: estricta para el ayuno en curso, 95 por ciento (contrato previo del calendario) para el cerrado. Los siete lectores la llaman.</w:t>
+            </w:r>
+          </w:p>
+          <w:p>
+            <w:pPr>
+              <w:spacing w:after="0" w:before="0"/>
+            </w:pPr>
+            <w:r>
+              <w:rPr>
+                <w:rFonts w:ascii="Calibri" w:cs="Calibri" w:eastAsia="Calibri" w:hAnsi="Calibri"/>
+                <w:color w:val="4A555C"/>
+                <w:sz w:val="15"/>
+                <w:szCs w:val="15"/>
+              </w:rPr>
               <w:t xml:space="preserve">BACKLOG_MAESTRO sección 4. Por eso la racha nueva cuenta días con ayuno válido en vez de "alcanzó su meta".</w:t>
             </w:r>
           </w:p>
@@ -11144,11 +11591,11 @@
                 <w:rFonts w:ascii="Calibri" w:cs="Calibri" w:eastAsia="Calibri" w:hAnsi="Calibri"/>
                 <w:b w:val="false"/>
                 <w:bCs w:val="false"/>
-                <w:color w:val="4A555C"/>
-                <w:sz w:val="17"/>
-                <w:szCs w:val="17"/>
-              </w:rPr>
-              <w:t xml:space="preserve">No bloquea</w:t>
+                <w:color w:val="4F6B0D"/>
+                <w:sz w:val="17"/>
+                <w:szCs w:val="17"/>
+              </w:rPr>
+              <w:t xml:space="preserve">Cerrado</w:t>
             </w:r>
           </w:p>
         </w:tc>
@@ -11173,7 +11620,7 @@
                 <w:sz w:val="17"/>
                 <w:szCs w:val="17"/>
               </w:rPr>
-              <w:t xml:space="preserve">Mediano</w:t>
+              <w:t xml:space="preserve"/>
             </w:r>
           </w:p>
         </w:tc>
@@ -11223,7 +11670,7 @@
                 <w:rFonts w:ascii="Calibri" w:cs="Calibri" w:eastAsia="Calibri" w:hAnsi="Calibri"/>
                 <w:b/>
                 <w:bCs/>
-                <w:color w:val="1A1A1A"/>
+                <w:color w:val="4A555C"/>
                 <w:sz w:val="17"/>
                 <w:szCs w:val="17"/>
               </w:rPr>
@@ -11243,15 +11690,31 @@
           </w:tcPr>
           <w:p>
             <w:pPr>
-              <w:spacing w:after="0" w:before="0"/>
-            </w:pPr>
-            <w:r>
-              <w:rPr>
-                <w:rFonts w:ascii="Calibri" w:cs="Calibri" w:eastAsia="Calibri" w:hAnsi="Calibri"/>
-                <w:color w:val="4A555C"/>
+              <w:spacing w:after="50" w:before="0"/>
+            </w:pPr>
+            <w:r>
+              <w:rPr>
+                <w:rFonts w:ascii="Calibri" w:cs="Calibri" w:eastAsia="Calibri" w:hAnsi="Calibri"/>
+                <w:b/>
+                <w:bCs/>
+                <w:color w:val="4F6B0D"/>
                 <w:sz w:val="16"/>
                 <w:szCs w:val="16"/>
               </w:rPr>
+              <w:t xml:space="preserve">RESUELTO 31-ago. El cierre automatico corre al compilar el dia (no solo al abrir la pantalla), es idempotente entre dispositivos, y deja huella para que el aviso legal de las 120 horas se muestre igual. FLAG: la limpieza de 9 filas raras esta propuesta, no aplicada.</w:t>
+            </w:r>
+          </w:p>
+          <w:p>
+            <w:pPr>
+              <w:spacing w:after="0" w:before="0"/>
+            </w:pPr>
+            <w:r>
+              <w:rPr>
+                <w:rFonts w:ascii="Calibri" w:cs="Calibri" w:eastAsia="Calibri" w:hAnsi="Calibri"/>
+                <w:color w:val="4A555C"/>
+                <w:sz w:val="15"/>
+                <w:szCs w:val="15"/>
+              </w:rPr>
               <w:t xml:space="preserve">Misma fuente.</w:t>
             </w:r>
           </w:p>
@@ -11275,11 +11738,11 @@
                 <w:rFonts w:ascii="Calibri" w:cs="Calibri" w:eastAsia="Calibri" w:hAnsi="Calibri"/>
                 <w:b w:val="false"/>
                 <w:bCs w:val="false"/>
-                <w:color w:val="4A555C"/>
-                <w:sz w:val="17"/>
-                <w:szCs w:val="17"/>
-              </w:rPr>
-              <w:t xml:space="preserve">No bloquea</w:t>
+                <w:color w:val="4F6B0D"/>
+                <w:sz w:val="17"/>
+                <w:szCs w:val="17"/>
+              </w:rPr>
+              <w:t xml:space="preserve">Cerrado</w:t>
             </w:r>
           </w:p>
         </w:tc>
@@ -11304,7 +11767,7 @@
                 <w:sz w:val="17"/>
                 <w:szCs w:val="17"/>
               </w:rPr>
-              <w:t xml:space="preserve">Mediano</w:t>
+              <w:t xml:space="preserve"/>
             </w:r>
           </w:p>
         </w:tc>
@@ -11354,7 +11817,7 @@
                 <w:rFonts w:ascii="Calibri" w:cs="Calibri" w:eastAsia="Calibri" w:hAnsi="Calibri"/>
                 <w:b/>
                 <w:bCs/>
-                <w:color w:val="1A1A1A"/>
+                <w:color w:val="4A555C"/>
                 <w:sz w:val="17"/>
                 <w:szCs w:val="17"/>
               </w:rPr>
@@ -11374,15 +11837,31 @@
           </w:tcPr>
           <w:p>
             <w:pPr>
-              <w:spacing w:after="0" w:before="0"/>
-            </w:pPr>
-            <w:r>
-              <w:rPr>
-                <w:rFonts w:ascii="Calibri" w:cs="Calibri" w:eastAsia="Calibri" w:hAnsi="Calibri"/>
-                <w:color w:val="4A555C"/>
+              <w:spacing w:after="50" w:before="0"/>
+            </w:pPr>
+            <w:r>
+              <w:rPr>
+                <w:rFonts w:ascii="Calibri" w:cs="Calibri" w:eastAsia="Calibri" w:hAnsi="Calibri"/>
+                <w:b/>
+                <w:bCs/>
+                <w:color w:val="4F6B0D"/>
                 <w:sz w:val="16"/>
                 <w:szCs w:val="16"/>
               </w:rPr>
+              <w:t xml:space="preserve">RESUELTO 31-ago. La mediana se pinta en la tira de estadisticas.</w:t>
+            </w:r>
+          </w:p>
+          <w:p>
+            <w:pPr>
+              <w:spacing w:after="0" w:before="0"/>
+            </w:pPr>
+            <w:r>
+              <w:rPr>
+                <w:rFonts w:ascii="Calibri" w:cs="Calibri" w:eastAsia="Calibri" w:hAnsi="Calibri"/>
+                <w:color w:val="4A555C"/>
+                <w:sz w:val="15"/>
+                <w:szCs w:val="15"/>
+              </w:rPr>
               <w:t xml:space="preserve">ENTREGA_NOCHE_2026-08-28.md. Es el número más honesto cuando hay outliers, y hoy solo se ve el promedio.</w:t>
             </w:r>
           </w:p>
@@ -11406,11 +11885,11 @@
                 <w:rFonts w:ascii="Calibri" w:cs="Calibri" w:eastAsia="Calibri" w:hAnsi="Calibri"/>
                 <w:b w:val="false"/>
                 <w:bCs w:val="false"/>
-                <w:color w:val="4A555C"/>
-                <w:sz w:val="17"/>
-                <w:szCs w:val="17"/>
-              </w:rPr>
-              <w:t xml:space="preserve">No bloquea</w:t>
+                <w:color w:val="4F6B0D"/>
+                <w:sz w:val="17"/>
+                <w:szCs w:val="17"/>
+              </w:rPr>
+              <w:t xml:space="preserve">Cerrado</w:t>
             </w:r>
           </w:p>
         </w:tc>
@@ -11435,7 +11914,7 @@
                 <w:sz w:val="17"/>
                 <w:szCs w:val="17"/>
               </w:rPr>
-              <w:t xml:space="preserve">Chico</w:t>
+              <w:t xml:space="preserve"/>
             </w:r>
           </w:p>
         </w:tc>
@@ -11485,7 +11964,7 @@
                 <w:rFonts w:ascii="Calibri" w:cs="Calibri" w:eastAsia="Calibri" w:hAnsi="Calibri"/>
                 <w:b/>
                 <w:bCs/>
-                <w:color w:val="1A1A1A"/>
+                <w:color w:val="4A555C"/>
                 <w:sz w:val="17"/>
                 <w:szCs w:val="17"/>
               </w:rPr>
@@ -11505,15 +11984,31 @@
           </w:tcPr>
           <w:p>
             <w:pPr>
-              <w:spacing w:after="0" w:before="0"/>
-            </w:pPr>
-            <w:r>
-              <w:rPr>
-                <w:rFonts w:ascii="Calibri" w:cs="Calibri" w:eastAsia="Calibri" w:hAnsi="Calibri"/>
-                <w:color w:val="4A555C"/>
+              <w:spacing w:after="50" w:before="0"/>
+            </w:pPr>
+            <w:r>
+              <w:rPr>
+                <w:rFonts w:ascii="Calibri" w:cs="Calibri" w:eastAsia="Calibri" w:hAnsi="Calibri"/>
+                <w:b/>
+                <w:bCs/>
+                <w:color w:val="4F6B0D"/>
                 <w:sz w:val="16"/>
                 <w:szCs w:val="16"/>
               </w:rPr>
+              <w:t xml:space="preserve">RESUELTO 31-ago en lo honesto: cada fase dice "aproximado" y en el codigo cada ventana lleva su fuente y PENDIENTE FIRMA MARIANA. Las ventanas mismas no se tocaron.</w:t>
+            </w:r>
+          </w:p>
+          <w:p>
+            <w:pPr>
+              <w:spacing w:after="0" w:before="0"/>
+            </w:pPr>
+            <w:r>
+              <w:rPr>
+                <w:rFonts w:ascii="Calibri" w:cs="Calibri" w:eastAsia="Calibri" w:hAnsi="Calibri"/>
+                <w:color w:val="4A555C"/>
+                <w:sz w:val="15"/>
+                <w:szCs w:val="15"/>
+              </w:rPr>
               <w:t xml:space="preserve">PENDIENTES_COMPLETOS F-9. el contenido de la pastilla de etapa metabólica en vivo. el envío. Chico una vez que decidas.</w:t>
             </w:r>
           </w:p>
@@ -11537,11 +12032,11 @@
                 <w:rFonts w:ascii="Calibri" w:cs="Calibri" w:eastAsia="Calibri" w:hAnsi="Calibri"/>
                 <w:b w:val="false"/>
                 <w:bCs w:val="false"/>
-                <w:color w:val="4A555C"/>
-                <w:sz w:val="17"/>
-                <w:szCs w:val="17"/>
-              </w:rPr>
-              <w:t xml:space="preserve">No bloquea</w:t>
+                <w:color w:val="4F6B0D"/>
+                <w:sz w:val="17"/>
+                <w:szCs w:val="17"/>
+              </w:rPr>
+              <w:t xml:space="preserve">Cerrado</w:t>
             </w:r>
           </w:p>
         </w:tc>
@@ -11566,7 +12061,7 @@
                 <w:sz w:val="17"/>
                 <w:szCs w:val="17"/>
               </w:rPr>
-              <w:t xml:space="preserve">Chico</w:t>
+              <w:t xml:space="preserve"/>
             </w:r>
           </w:p>
         </w:tc>
@@ -12074,7 +12569,7 @@
                 <w:rFonts w:ascii="Calibri" w:cs="Calibri" w:eastAsia="Calibri" w:hAnsi="Calibri"/>
                 <w:b/>
                 <w:bCs/>
-                <w:color w:val="1A1A1A"/>
+                <w:color w:val="4A555C"/>
                 <w:sz w:val="17"/>
                 <w:szCs w:val="17"/>
               </w:rPr>
@@ -12094,15 +12589,31 @@
           </w:tcPr>
           <w:p>
             <w:pPr>
-              <w:spacing w:after="0" w:before="0"/>
-            </w:pPr>
-            <w:r>
-              <w:rPr>
-                <w:rFonts w:ascii="Calibri" w:cs="Calibri" w:eastAsia="Calibri" w:hAnsi="Calibri"/>
-                <w:color w:val="4A555C"/>
+              <w:spacing w:after="50" w:before="0"/>
+            </w:pPr>
+            <w:r>
+              <w:rPr>
+                <w:rFonts w:ascii="Calibri" w:cs="Calibri" w:eastAsia="Calibri" w:hAnsi="Calibri"/>
+                <w:b/>
+                <w:bCs/>
+                <w:color w:val="4F6B0D"/>
                 <w:sz w:val="16"/>
                 <w:szCs w:val="16"/>
               </w:rPr>
+              <w:t xml:space="preserve">RESUELTO 31-ago. La ficha de receta es una hoja real (ingredientes con sustitutos y notas, pasos numerados, macros con raya) con tres salidas: Registrar hoy, Mandar a la lista, y Pedirle a ARGOS que la modifique (abre el chat con la receta cargada). De paso: la lista de super ya no pierde las fracciones (109 ingredientes con 1/2, 1/4, 3/4).</w:t>
+            </w:r>
+          </w:p>
+          <w:p>
+            <w:pPr>
+              <w:spacing w:after="0" w:before="0"/>
+            </w:pPr>
+            <w:r>
+              <w:rPr>
+                <w:rFonts w:ascii="Calibri" w:cs="Calibri" w:eastAsia="Calibri" w:hAnsi="Calibri"/>
+                <w:color w:val="4A555C"/>
+                <w:sz w:val="15"/>
+                <w:szCs w:val="15"/>
+              </w:rPr>
               <w:t xml:space="preserve">ENTREGA_NOCHE_2026-08-28.md, deuda declarada. Se hizo así porque no había compilador para validar una hoja nueva.</w:t>
             </w:r>
           </w:p>
@@ -12126,11 +12637,11 @@
                 <w:rFonts w:ascii="Calibri" w:cs="Calibri" w:eastAsia="Calibri" w:hAnsi="Calibri"/>
                 <w:b w:val="false"/>
                 <w:bCs w:val="false"/>
-                <w:color w:val="4A555C"/>
-                <w:sz w:val="17"/>
-                <w:szCs w:val="17"/>
-              </w:rPr>
-              <w:t xml:space="preserve">No bloquea</w:t>
+                <w:color w:val="4F6B0D"/>
+                <w:sz w:val="17"/>
+                <w:szCs w:val="17"/>
+              </w:rPr>
+              <w:t xml:space="preserve">Cerrado</w:t>
             </w:r>
           </w:p>
         </w:tc>
@@ -12155,7 +12666,7 @@
                 <w:sz w:val="17"/>
                 <w:szCs w:val="17"/>
               </w:rPr>
-              <w:t xml:space="preserve">Mediano</w:t>
+              <w:t xml:space="preserve"/>
             </w:r>
           </w:p>
         </w:tc>
@@ -13497,7 +14008,7 @@
                 <w:rFonts w:ascii="Calibri" w:cs="Calibri" w:eastAsia="Calibri" w:hAnsi="Calibri"/>
                 <w:b/>
                 <w:bCs/>
-                <w:color w:val="1A1A1A"/>
+                <w:color w:val="4A555C"/>
                 <w:sz w:val="17"/>
                 <w:szCs w:val="17"/>
               </w:rPr>
@@ -13517,15 +14028,31 @@
           </w:tcPr>
           <w:p>
             <w:pPr>
-              <w:spacing w:after="0" w:before="0"/>
-            </w:pPr>
-            <w:r>
-              <w:rPr>
-                <w:rFonts w:ascii="Calibri" w:cs="Calibri" w:eastAsia="Calibri" w:hAnsi="Calibri"/>
-                <w:color w:val="4A555C"/>
+              <w:spacing w:after="50" w:before="0"/>
+            </w:pPr>
+            <w:r>
+              <w:rPr>
+                <w:rFonts w:ascii="Calibri" w:cs="Calibri" w:eastAsia="Calibri" w:hAnsi="Calibri"/>
+                <w:b/>
+                <w:bCs/>
+                <w:color w:val="4F6B0D"/>
                 <w:sz w:val="16"/>
                 <w:szCs w:val="16"/>
               </w:rPr>
+              <w:t xml:space="preserve">RESUELTO 31-ago. Una sola formula de ovulacion (ventanaOvulatoria) para tarjeta, calendario y Entrenar; verificada contra los ciclos reales de las tres usuarias. Definicion pendiente de firma de Mariana.</w:t>
+            </w:r>
+          </w:p>
+          <w:p>
+            <w:pPr>
+              <w:spacing w:after="0" w:before="0"/>
+            </w:pPr>
+            <w:r>
+              <w:rPr>
+                <w:rFonts w:ascii="Calibri" w:cs="Calibri" w:eastAsia="Calibri" w:hAnsi="Calibri"/>
+                <w:color w:val="4A555C"/>
+                <w:sz w:val="15"/>
+                <w:szCs w:val="15"/>
+              </w:rPr>
               <w:t xml:space="preserve">app/cycle.tsx:770-777 reconoce en comentario que fase === 'ovulation' sale del umbral PHASE_OVULATION_END, o sea una segunda fórmula de ovulación sobre el mismo dato, y lo justifica diciendo que describe dónde va el cuerpo y no qué día se ovula. Es una convivencia declarada, no un error, pero sigue habiendo dos aritméticas. Sin verificar: si /reports/ciclo (ciclo-report-core.ts:40-49) ya usa la ve</w:t>
             </w:r>
           </w:p>
@@ -13547,13 +14074,13 @@
             <w:r>
               <w:rPr>
                 <w:rFonts w:ascii="Calibri" w:cs="Calibri" w:eastAsia="Calibri" w:hAnsi="Calibri"/>
-                <w:b/>
-                <w:bCs/>
-                <w:color w:val="991B1B"/>
-                <w:sz w:val="17"/>
-                <w:szCs w:val="17"/>
-              </w:rPr>
-              <w:t xml:space="preserve">Bloquea</w:t>
+                <w:b w:val="false"/>
+                <w:bCs w:val="false"/>
+                <w:color w:val="4F6B0D"/>
+                <w:sz w:val="17"/>
+                <w:szCs w:val="17"/>
+              </w:rPr>
+              <w:t xml:space="preserve">Cerrado</w:t>
             </w:r>
           </w:p>
         </w:tc>
@@ -13578,7 +14105,7 @@
                 <w:sz w:val="17"/>
                 <w:szCs w:val="17"/>
               </w:rPr>
-              <w:t xml:space="preserve">Chico</w:t>
+              <w:t xml:space="preserve"/>
             </w:r>
           </w:p>
         </w:tc>
@@ -13628,7 +14155,7 @@
                 <w:rFonts w:ascii="Calibri" w:cs="Calibri" w:eastAsia="Calibri" w:hAnsi="Calibri"/>
                 <w:b/>
                 <w:bCs/>
-                <w:color w:val="1A1A1A"/>
+                <w:color w:val="4A555C"/>
                 <w:sz w:val="17"/>
                 <w:szCs w:val="17"/>
               </w:rPr>
@@ -13648,15 +14175,31 @@
           </w:tcPr>
           <w:p>
             <w:pPr>
-              <w:spacing w:after="0" w:before="0"/>
-            </w:pPr>
-            <w:r>
-              <w:rPr>
-                <w:rFonts w:ascii="Calibri" w:cs="Calibri" w:eastAsia="Calibri" w:hAnsi="Calibri"/>
-                <w:color w:val="4A555C"/>
+              <w:spacing w:after="50" w:before="0"/>
+            </w:pPr>
+            <w:r>
+              <w:rPr>
+                <w:rFonts w:ascii="Calibri" w:cs="Calibri" w:eastAsia="Calibri" w:hAnsi="Calibri"/>
+                <w:b/>
+                <w:bCs/>
+                <w:color w:val="4F6B0D"/>
                 <w:sz w:val="16"/>
                 <w:szCs w:val="16"/>
               </w:rPr>
+              <w:t xml:space="preserve">RESUELTO 31-ago. confidence se retiro: nadie lo leia y ya existia otra escala con criterio FIGO.</w:t>
+            </w:r>
+          </w:p>
+          <w:p>
+            <w:pPr>
+              <w:spacing w:after="0" w:before="0"/>
+            </w:pPr>
+            <w:r>
+              <w:rPr>
+                <w:rFonts w:ascii="Calibri" w:cs="Calibri" w:eastAsia="Calibri" w:hAnsi="Calibri"/>
+                <w:color w:val="4A555C"/>
+                <w:sz w:val="15"/>
+                <w:szCs w:val="15"/>
+              </w:rPr>
               <w:t xml:space="preserve">BACKLOG_MAESTRO 1.4.</w:t>
             </w:r>
           </w:p>
@@ -13680,11 +14223,11 @@
                 <w:rFonts w:ascii="Calibri" w:cs="Calibri" w:eastAsia="Calibri" w:hAnsi="Calibri"/>
                 <w:b w:val="false"/>
                 <w:bCs w:val="false"/>
-                <w:color w:val="4A555C"/>
-                <w:sz w:val="17"/>
-                <w:szCs w:val="17"/>
-              </w:rPr>
-              <w:t xml:space="preserve">No bloquea</w:t>
+                <w:color w:val="4F6B0D"/>
+                <w:sz w:val="17"/>
+                <w:szCs w:val="17"/>
+              </w:rPr>
+              <w:t xml:space="preserve">Cerrado</w:t>
             </w:r>
           </w:p>
         </w:tc>
@@ -13709,7 +14252,7 @@
                 <w:sz w:val="17"/>
                 <w:szCs w:val="17"/>
               </w:rPr>
-              <w:t xml:space="preserve">Chico</w:t>
+              <w:t xml:space="preserve"/>
             </w:r>
           </w:p>
         </w:tc>
@@ -13759,7 +14302,7 @@
                 <w:rFonts w:ascii="Calibri" w:cs="Calibri" w:eastAsia="Calibri" w:hAnsi="Calibri"/>
                 <w:b/>
                 <w:bCs/>
-                <w:color w:val="1A1A1A"/>
+                <w:color w:val="4A555C"/>
                 <w:sz w:val="17"/>
                 <w:szCs w:val="17"/>
               </w:rPr>
@@ -13779,15 +14322,31 @@
           </w:tcPr>
           <w:p>
             <w:pPr>
-              <w:spacing w:after="0" w:before="0"/>
-            </w:pPr>
-            <w:r>
-              <w:rPr>
-                <w:rFonts w:ascii="Calibri" w:cs="Calibri" w:eastAsia="Calibri" w:hAnsi="Calibri"/>
-                <w:color w:val="4A555C"/>
+              <w:spacing w:after="50" w:before="0"/>
+            </w:pPr>
+            <w:r>
+              <w:rPr>
+                <w:rFonts w:ascii="Calibri" w:cs="Calibri" w:eastAsia="Calibri" w:hAnsi="Calibri"/>
+                <w:b/>
+                <w:bCs/>
+                <w:color w:val="4F6B0D"/>
                 <w:sz w:val="16"/>
                 <w:szCs w:val="16"/>
               </w:rPr>
+              <w:t xml:space="preserve">RESUELTO 31-ago. Si falla la lectura del perfil, el kit lo dice con Reintentar en vez de esconder Ciclo; y ya no se siembra la cuadricula sin perfil leido.</w:t>
+            </w:r>
+          </w:p>
+          <w:p>
+            <w:pPr>
+              <w:spacing w:after="0" w:before="0"/>
+            </w:pPr>
+            <w:r>
+              <w:rPr>
+                <w:rFonts w:ascii="Calibri" w:cs="Calibri" w:eastAsia="Calibri" w:hAnsi="Calibri"/>
+                <w:color w:val="4A555C"/>
+                <w:sz w:val="15"/>
+                <w:szCs w:val="15"/>
+              </w:rPr>
               <w:t xml:space="preserve">ENTREGA_NOCHE_2026-08-29.md, deuda declarada. Un error de red y un perfil sin sexo biológico se tratan igual. La entrega recomienda hablarlo con Mariana antes de parchear.</w:t>
             </w:r>
           </w:p>
@@ -13811,11 +14370,11 @@
                 <w:rFonts w:ascii="Calibri" w:cs="Calibri" w:eastAsia="Calibri" w:hAnsi="Calibri"/>
                 <w:b w:val="false"/>
                 <w:bCs w:val="false"/>
-                <w:color w:val="4A555C"/>
-                <w:sz w:val="17"/>
-                <w:szCs w:val="17"/>
-              </w:rPr>
-              <w:t xml:space="preserve">No bloquea</w:t>
+                <w:color w:val="4F6B0D"/>
+                <w:sz w:val="17"/>
+                <w:szCs w:val="17"/>
+              </w:rPr>
+              <w:t xml:space="preserve">Cerrado</w:t>
             </w:r>
           </w:p>
         </w:tc>
@@ -13840,7 +14399,7 @@
                 <w:sz w:val="17"/>
                 <w:szCs w:val="17"/>
               </w:rPr>
-              <w:t xml:space="preserve">Chico</w:t>
+              <w:t xml:space="preserve"/>
             </w:r>
           </w:p>
         </w:tc>
@@ -13890,7 +14449,7 @@
                 <w:rFonts w:ascii="Calibri" w:cs="Calibri" w:eastAsia="Calibri" w:hAnsi="Calibri"/>
                 <w:b/>
                 <w:bCs/>
-                <w:color w:val="1A1A1A"/>
+                <w:color w:val="4A555C"/>
                 <w:sz w:val="17"/>
                 <w:szCs w:val="17"/>
               </w:rPr>
@@ -13910,15 +14469,31 @@
           </w:tcPr>
           <w:p>
             <w:pPr>
-              <w:spacing w:after="0" w:before="0"/>
-            </w:pPr>
-            <w:r>
-              <w:rPr>
-                <w:rFonts w:ascii="Calibri" w:cs="Calibri" w:eastAsia="Calibri" w:hAnsi="Calibri"/>
-                <w:color w:val="4A555C"/>
+              <w:spacing w:after="50" w:before="0"/>
+            </w:pPr>
+            <w:r>
+              <w:rPr>
+                <w:rFonts w:ascii="Calibri" w:cs="Calibri" w:eastAsia="Calibri" w:hAnsi="Calibri"/>
+                <w:b/>
+                <w:bCs/>
+                <w:color w:val="4F6B0D"/>
                 <w:sz w:val="16"/>
                 <w:szCs w:val="16"/>
               </w:rPr>
+              <w:t xml:space="preserve">RESUELTO 31-ago. CB-7 se pide en la puerta de Ciclo, Ajustes de ciclo y Reportes de ciclo. "Ahora no" no escribe en el log legal (se recuerda local). FLAG decision: si CB-7 debe cerrar tambien lo que Entrenar/ARGOS/HOY leen del ciclo.</w:t>
+            </w:r>
+          </w:p>
+          <w:p>
+            <w:pPr>
+              <w:spacing w:after="0" w:before="0"/>
+            </w:pPr>
+            <w:r>
+              <w:rPr>
+                <w:rFonts w:ascii="Calibri" w:cs="Calibri" w:eastAsia="Calibri" w:hAnsi="Calibri"/>
+                <w:color w:val="4A555C"/>
+                <w:sz w:val="15"/>
+                <w:szCs w:val="15"/>
+              </w:rPr>
               <w:t xml:space="preserve">Ver 5.2. Mediano. ---</w:t>
             </w:r>
           </w:p>
@@ -13940,13 +14515,13 @@
             <w:r>
               <w:rPr>
                 <w:rFonts w:ascii="Calibri" w:cs="Calibri" w:eastAsia="Calibri" w:hAnsi="Calibri"/>
-                <w:b/>
-                <w:bCs/>
-                <w:color w:val="991B1B"/>
-                <w:sz w:val="17"/>
-                <w:szCs w:val="17"/>
-              </w:rPr>
-              <w:t xml:space="preserve">Bloquea</w:t>
+                <w:b w:val="false"/>
+                <w:bCs w:val="false"/>
+                <w:color w:val="4F6B0D"/>
+                <w:sz w:val="17"/>
+                <w:szCs w:val="17"/>
+              </w:rPr>
+              <w:t xml:space="preserve">Cerrado</w:t>
             </w:r>
           </w:p>
         </w:tc>
@@ -13971,7 +14546,7 @@
                 <w:sz w:val="17"/>
                 <w:szCs w:val="17"/>
               </w:rPr>
-              <w:t xml:space="preserve">Mediano</w:t>
+              <w:t xml:space="preserve"/>
             </w:r>
           </w:p>
         </w:tc>
@@ -14479,7 +15054,7 @@
                 <w:rFonts w:ascii="Calibri" w:cs="Calibri" w:eastAsia="Calibri" w:hAnsi="Calibri"/>
                 <w:b/>
                 <w:bCs/>
-                <w:color w:val="1A1A1A"/>
+                <w:color w:val="4A555C"/>
                 <w:sz w:val="17"/>
                 <w:szCs w:val="17"/>
               </w:rPr>
@@ -14499,15 +15074,31 @@
           </w:tcPr>
           <w:p>
             <w:pPr>
-              <w:spacing w:after="0" w:before="0"/>
-            </w:pPr>
-            <w:r>
-              <w:rPr>
-                <w:rFonts w:ascii="Calibri" w:cs="Calibri" w:eastAsia="Calibri" w:hAnsi="Calibri"/>
-                <w:color w:val="4A555C"/>
+              <w:spacing w:after="50" w:before="0"/>
+            </w:pPr>
+            <w:r>
+              <w:rPr>
+                <w:rFonts w:ascii="Calibri" w:cs="Calibri" w:eastAsia="Calibri" w:hAnsi="Calibri"/>
+                <w:b/>
+                <w:bCs/>
+                <w:color w:val="4F6B0D"/>
                 <w:sz w:val="16"/>
                 <w:szCs w:val="16"/>
               </w:rPr>
+              <w:t xml:space="preserve">RESUELTO 31-ago con el protocolo que definio Enrique: al fallar, se cancela, se limpia el archivo huerfano de storage, se suelta el candado y se dice "vuelvelo a intentar"; el fallo viaja a Sentry con etapa, tipo y tamano para corregir la causa cuando llegue.</w:t>
+            </w:r>
+          </w:p>
+          <w:p>
+            <w:pPr>
+              <w:spacing w:after="0" w:before="0"/>
+            </w:pPr>
+            <w:r>
+              <w:rPr>
+                <w:rFonts w:ascii="Calibri" w:cs="Calibri" w:eastAsia="Calibri" w:hAnsi="Calibri"/>
+                <w:color w:val="4A555C"/>
+                <w:sz w:val="15"/>
+                <w:szCs w:val="15"/>
+              </w:rPr>
               <w:t xml:space="preserve">El candado eligiendoRef ya tiene dueño por token y caducidad (app/my-health.tsx:117-136), y el FileReader ya tiene onerror. Sigue sin cerrarse la pregunta que solo tú puedes contestar: cuando falla, ¿es también en el primer intento después de cerrar la app por completo y reabrirla? Y sigue abierto qué se publicó, OTA o build, el 18 o 19 de junio, que es el sospechoso con motivo y oportunidad. Adem</w:t>
             </w:r>
           </w:p>
@@ -14529,13 +15120,13 @@
             <w:r>
               <w:rPr>
                 <w:rFonts w:ascii="Calibri" w:cs="Calibri" w:eastAsia="Calibri" w:hAnsi="Calibri"/>
-                <w:b/>
-                <w:bCs/>
-                <w:color w:val="991B1B"/>
-                <w:sz w:val="17"/>
-                <w:szCs w:val="17"/>
-              </w:rPr>
-              <w:t xml:space="preserve">Bloquea</w:t>
+                <w:b w:val="false"/>
+                <w:bCs w:val="false"/>
+                <w:color w:val="4F6B0D"/>
+                <w:sz w:val="17"/>
+                <w:szCs w:val="17"/>
+              </w:rPr>
+              <w:t xml:space="preserve">Cerrado</w:t>
             </w:r>
           </w:p>
         </w:tc>
@@ -14560,7 +15151,7 @@
                 <w:sz w:val="17"/>
                 <w:szCs w:val="17"/>
               </w:rPr>
-              <w:t xml:space="preserve">Chico</w:t>
+              <w:t xml:space="preserve"/>
             </w:r>
           </w:p>
         </w:tc>
@@ -15723,7 +16314,7 @@
                 <w:rFonts w:ascii="Calibri" w:cs="Calibri" w:eastAsia="Calibri" w:hAnsi="Calibri"/>
                 <w:b/>
                 <w:bCs/>
-                <w:color w:val="1A1A1A"/>
+                <w:color w:val="4A555C"/>
                 <w:sz w:val="17"/>
                 <w:szCs w:val="17"/>
               </w:rPr>
@@ -15743,15 +16334,31 @@
           </w:tcPr>
           <w:p>
             <w:pPr>
-              <w:spacing w:after="0" w:before="0"/>
-            </w:pPr>
-            <w:r>
-              <w:rPr>
-                <w:rFonts w:ascii="Calibri" w:cs="Calibri" w:eastAsia="Calibri" w:hAnsi="Calibri"/>
-                <w:color w:val="4A555C"/>
+              <w:spacing w:after="50" w:before="0"/>
+            </w:pPr>
+            <w:r>
+              <w:rPr>
+                <w:rFonts w:ascii="Calibri" w:cs="Calibri" w:eastAsia="Calibri" w:hAnsi="Calibri"/>
+                <w:b/>
+                <w:bCs/>
+                <w:color w:val="4F6B0D"/>
                 <w:sz w:val="16"/>
                 <w:szCs w:val="16"/>
               </w:rPr>
+              <w:t xml:space="preserve">YA ESTABA RESUELTO (commit 54c7338, 22-ago): la regla paso de porcentaje a conteo de errores. El documento estaba desactualizado.</w:t>
+            </w:r>
+          </w:p>
+          <w:p>
+            <w:pPr>
+              <w:spacing w:after="0" w:before="0"/>
+            </w:pPr>
+            <w:r>
+              <w:rPr>
+                <w:rFonts w:ascii="Calibri" w:cs="Calibri" w:eastAsia="Calibri" w:hAnsi="Calibri"/>
+                <w:color w:val="4A555C"/>
+                <w:sz w:val="15"/>
+                <w:szCs w:val="15"/>
+              </w:rPr>
               <w:t xml:space="preserve">PENDIENTES_COMPLETOS, "agregado a la cola 17-ago". Hipótesis: el porcentaje se cuenta por separado para el canal auditivo y el visual, cada uno contra el total de reactivos en vez de contra los suyos. Dónde mirar: src/services/mente/nback-core.ts. Chico el diagnóstico.</w:t>
             </w:r>
           </w:p>
@@ -15775,11 +16382,11 @@
                 <w:rFonts w:ascii="Calibri" w:cs="Calibri" w:eastAsia="Calibri" w:hAnsi="Calibri"/>
                 <w:b w:val="false"/>
                 <w:bCs w:val="false"/>
-                <w:color w:val="4A555C"/>
-                <w:sz w:val="17"/>
-                <w:szCs w:val="17"/>
-              </w:rPr>
-              <w:t xml:space="preserve">No bloquea</w:t>
+                <w:color w:val="4F6B0D"/>
+                <w:sz w:val="17"/>
+                <w:szCs w:val="17"/>
+              </w:rPr>
+              <w:t xml:space="preserve">Cerrado</w:t>
             </w:r>
           </w:p>
         </w:tc>
@@ -15804,7 +16411,7 @@
                 <w:sz w:val="17"/>
                 <w:szCs w:val="17"/>
               </w:rPr>
-              <w:t xml:space="preserve">Chico</w:t>
+              <w:t xml:space="preserve"/>
             </w:r>
           </w:p>
         </w:tc>
@@ -18211,7 +18818,7 @@
                 <w:rFonts w:ascii="Calibri" w:cs="Calibri" w:eastAsia="Calibri" w:hAnsi="Calibri"/>
                 <w:b/>
                 <w:bCs/>
-                <w:color w:val="1A1A1A"/>
+                <w:color w:val="4A555C"/>
                 <w:sz w:val="17"/>
                 <w:szCs w:val="17"/>
               </w:rPr>
@@ -18231,15 +18838,31 @@
           </w:tcPr>
           <w:p>
             <w:pPr>
-              <w:spacing w:after="0" w:before="0"/>
-            </w:pPr>
-            <w:r>
-              <w:rPr>
-                <w:rFonts w:ascii="Calibri" w:cs="Calibri" w:eastAsia="Calibri" w:hAnsi="Calibri"/>
-                <w:color w:val="4A555C"/>
+              <w:spacing w:after="50" w:before="0"/>
+            </w:pPr>
+            <w:r>
+              <w:rPr>
+                <w:rFonts w:ascii="Calibri" w:cs="Calibri" w:eastAsia="Calibri" w:hAnsi="Calibri"/>
+                <w:b/>
+                <w:bCs/>
+                <w:color w:val="4F6B0D"/>
                 <w:sz w:val="16"/>
                 <w:szCs w:val="16"/>
               </w:rPr>
+              <w:t xml:space="preserve">RESUELTO 31-ago. El contenedor de navegacion sigue al tema: se acabo el destello negro entre pantallas en claro.</w:t>
+            </w:r>
+          </w:p>
+          <w:p>
+            <w:pPr>
+              <w:spacing w:after="0" w:before="0"/>
+            </w:pPr>
+            <w:r>
+              <w:rPr>
+                <w:rFonts w:ascii="Calibri" w:cs="Calibri" w:eastAsia="Calibri" w:hAnsi="Calibri"/>
+                <w:color w:val="4A555C"/>
+                <w:sz w:val="15"/>
+                <w:szCs w:val="15"/>
+              </w:rPr>
               <w:t xml:space="preserve">app/_layout.tsx:75,77: ...DarkTheme con la nota "tránsito MB-31B". Es la causa del destello negro en cada navegación en tema claro. Fuente: PENDIENTES_COMPLETOS L-7. Verificado hoy: sigue vivo. en mi criterio. Un parpadeo negro en cada navegación es lo primero que se nota y lo que hace que una app se sienta rota.</w:t>
             </w:r>
           </w:p>
@@ -18263,11 +18886,11 @@
                 <w:rFonts w:ascii="Calibri" w:cs="Calibri" w:eastAsia="Calibri" w:hAnsi="Calibri"/>
                 <w:b w:val="false"/>
                 <w:bCs w:val="false"/>
-                <w:color w:val="4A555C"/>
-                <w:sz w:val="17"/>
-                <w:szCs w:val="17"/>
-              </w:rPr>
-              <w:t xml:space="preserve">sin marcar</w:t>
+                <w:color w:val="4F6B0D"/>
+                <w:sz w:val="17"/>
+                <w:szCs w:val="17"/>
+              </w:rPr>
+              <w:t xml:space="preserve">Cerrado</w:t>
             </w:r>
           </w:p>
         </w:tc>
@@ -18292,7 +18915,7 @@
                 <w:sz w:val="17"/>
                 <w:szCs w:val="17"/>
               </w:rPr>
-              <w:t xml:space="preserve">Chico</w:t>
+              <w:t xml:space="preserve"/>
             </w:r>
           </w:p>
         </w:tc>
@@ -18342,7 +18965,7 @@
                 <w:rFonts w:ascii="Calibri" w:cs="Calibri" w:eastAsia="Calibri" w:hAnsi="Calibri"/>
                 <w:b/>
                 <w:bCs/>
-                <w:color w:val="1A1A1A"/>
+                <w:color w:val="4A555C"/>
                 <w:sz w:val="17"/>
                 <w:szCs w:val="17"/>
               </w:rPr>
@@ -18362,15 +18985,31 @@
           </w:tcPr>
           <w:p>
             <w:pPr>
-              <w:spacing w:after="0" w:before="0"/>
-            </w:pPr>
-            <w:r>
-              <w:rPr>
-                <w:rFonts w:ascii="Calibri" w:cs="Calibri" w:eastAsia="Calibri" w:hAnsi="Calibri"/>
-                <w:color w:val="4A555C"/>
+              <w:spacing w:after="50" w:before="0"/>
+            </w:pPr>
+            <w:r>
+              <w:rPr>
+                <w:rFonts w:ascii="Calibri" w:cs="Calibri" w:eastAsia="Calibri" w:hAnsi="Calibri"/>
+                <w:b/>
+                <w:bCs/>
+                <w:color w:val="4F6B0D"/>
                 <w:sz w:val="16"/>
                 <w:szCs w:val="16"/>
               </w:rPr>
+              <w:t xml:space="preserve">RESUELTO 31-ago. La nota "la app va por partes" se retiro: ya no era verdad.</w:t>
+            </w:r>
+          </w:p>
+          <w:p>
+            <w:pPr>
+              <w:spacing w:after="0" w:before="0"/>
+            </w:pPr>
+            <w:r>
+              <w:rPr>
+                <w:rFonts w:ascii="Calibri" w:cs="Calibri" w:eastAsia="Calibri" w:hAnsi="Calibri"/>
+                <w:color w:val="4A555C"/>
+                <w:sz w:val="15"/>
+                <w:szCs w:val="15"/>
+              </w:rPr>
               <w:t xml:space="preserve">app/settings/experiencia.tsx:105-106: *"El modo claro va llegando por partes: el marco ya cambia, pero varias pantallas siguen en oscuro mientras terminamos la migración."* Fuente: PENDIENTES_COMPLETOS L-6. Verificado hoy: sigue vivo. No se puede lanzar diciéndole al usuario que la app está a medias. Chico, pero borrarlo sin cerrar 21.1 es esconder el problema.</w:t>
             </w:r>
           </w:p>
@@ -18392,13 +19031,13 @@
             <w:r>
               <w:rPr>
                 <w:rFonts w:ascii="Calibri" w:cs="Calibri" w:eastAsia="Calibri" w:hAnsi="Calibri"/>
-                <w:b/>
-                <w:bCs/>
-                <w:color w:val="991B1B"/>
-                <w:sz w:val="17"/>
-                <w:szCs w:val="17"/>
-              </w:rPr>
-              <w:t xml:space="preserve">Bloquea</w:t>
+                <w:b w:val="false"/>
+                <w:bCs w:val="false"/>
+                <w:color w:val="4F6B0D"/>
+                <w:sz w:val="17"/>
+                <w:szCs w:val="17"/>
+              </w:rPr>
+              <w:t xml:space="preserve">Cerrado</w:t>
             </w:r>
           </w:p>
         </w:tc>
@@ -18423,7 +19062,7 @@
                 <w:sz w:val="17"/>
                 <w:szCs w:val="17"/>
               </w:rPr>
-              <w:t xml:space="preserve">Chico</w:t>
+              <w:t xml:space="preserve"/>
             </w:r>
           </w:p>
         </w:tc>
@@ -18473,7 +19112,7 @@
                 <w:rFonts w:ascii="Calibri" w:cs="Calibri" w:eastAsia="Calibri" w:hAnsi="Calibri"/>
                 <w:b/>
                 <w:bCs/>
-                <w:color w:val="1A1A1A"/>
+                <w:color w:val="4A555C"/>
                 <w:sz w:val="17"/>
                 <w:szCs w:val="17"/>
               </w:rPr>
@@ -18493,15 +19132,31 @@
           </w:tcPr>
           <w:p>
             <w:pPr>
-              <w:spacing w:after="0" w:before="0"/>
-            </w:pPr>
-            <w:r>
-              <w:rPr>
-                <w:rFonts w:ascii="Calibri" w:cs="Calibri" w:eastAsia="Calibri" w:hAnsi="Calibri"/>
-                <w:color w:val="4A555C"/>
+              <w:spacing w:after="50" w:before="0"/>
+            </w:pPr>
+            <w:r>
+              <w:rPr>
+                <w:rFonts w:ascii="Calibri" w:cs="Calibri" w:eastAsia="Calibri" w:hAnsi="Calibri"/>
+                <w:b/>
+                <w:bCs/>
+                <w:color w:val="4F6B0D"/>
                 <w:sz w:val="16"/>
                 <w:szCs w:val="16"/>
               </w:rPr>
+              <w:t xml:space="preserve">RESUELTO 31-ago. medidas (el footgun real: leia tokens fuera de ThemeReady), builder (StatusBar + pildora ilegible), composicion y register verificados con contraste medido. Las que ya estaban migradas se confirmaron.</w:t>
+            </w:r>
+          </w:p>
+          <w:p>
+            <w:pPr>
+              <w:spacing w:after="0" w:before="0"/>
+            </w:pPr>
+            <w:r>
+              <w:rPr>
+                <w:rFonts w:ascii="Calibri" w:cs="Calibri" w:eastAsia="Calibri" w:hAnsi="Calibri"/>
+                <w:color w:val="4A555C"/>
+                <w:sz w:val="15"/>
+                <w:szCs w:val="15"/>
+              </w:rPr>
               <w:t xml:space="preserve">register, reset-password, builder, medidas y composición corporal. La bandera AUTH_RESPETA_EL_TEMA está encendida y los commits de marca arreglaron el login, así que está a medio cerrar. Fuente: PENDIENTES_COMPLETOS L-8. register y reset-password, que son la primera pantalla después de pagar. Mediano. ---</w:t>
             </w:r>
           </w:p>
@@ -18523,13 +19178,13 @@
             <w:r>
               <w:rPr>
                 <w:rFonts w:ascii="Calibri" w:cs="Calibri" w:eastAsia="Calibri" w:hAnsi="Calibri"/>
-                <w:b/>
-                <w:bCs/>
-                <w:color w:val="991B1B"/>
-                <w:sz w:val="17"/>
-                <w:szCs w:val="17"/>
-              </w:rPr>
-              <w:t xml:space="preserve">Bloquea</w:t>
+                <w:b w:val="false"/>
+                <w:bCs w:val="false"/>
+                <w:color w:val="4F6B0D"/>
+                <w:sz w:val="17"/>
+                <w:szCs w:val="17"/>
+              </w:rPr>
+              <w:t xml:space="preserve">Cerrado</w:t>
             </w:r>
           </w:p>
         </w:tc>
@@ -18554,7 +19209,7 @@
                 <w:sz w:val="17"/>
                 <w:szCs w:val="17"/>
               </w:rPr>
-              <w:t xml:space="preserve">Mediano</w:t>
+              <w:t xml:space="preserve"/>
             </w:r>
           </w:p>
         </w:tc>

</xml_diff>